<commit_message>
Incorporated MP's comments. Made errors in animal_speed.txt consistent and removed RNG - was leading to typos in explanations.
</commit_message>
<xml_diff>
--- a/Workshops/Workshop 1 - Hidden assumptions/W1.docx
+++ b/Workshops/Workshop 1 - Hidden assumptions/W1.docx
@@ -23,7 +23,7 @@
         <w:pStyle w:val="Date"/>
       </w:pPr>
       <w:r>
-        <w:t>Last updated: 2024-08-14</w:t>
+        <w:t>Last updated: 2024-09-05</w:t>
       </w:r>
     </w:p>
     <w:sdt>
@@ -34,7 +34,7 @@
           <w:sz w:val="22"/>
           <w:szCs w:val="24"/>
         </w:rPr>
-        <w:id w:val="114039757"/>
+        <w:id w:val="-597644364"/>
         <w:docPartObj>
           <w:docPartGallery w:val="Table of Contents"/>
           <w:docPartUnique/>
@@ -73,7 +73,7 @@
           <w:r>
             <w:fldChar w:fldCharType="separate"/>
           </w:r>
-          <w:hyperlink w:anchor="_Toc174535062" w:history="1">
+          <w:hyperlink w:anchor="_Toc176426911" w:history="1">
             <w:r>
               <w:rPr>
                 <w:rStyle w:val="Hyperlink"/>
@@ -100,7 +100,7 @@
                 <w:noProof/>
                 <w:webHidden/>
               </w:rPr>
-              <w:instrText xml:space="preserve"> PAGEREF _Toc174535062 \h </w:instrText>
+              <w:instrText xml:space="preserve"> PAGEREF _Toc176426911 \h </w:instrText>
             </w:r>
             <w:r>
               <w:rPr>
@@ -146,7 +146,7 @@
               <w14:ligatures w14:val="standardContextual"/>
             </w:rPr>
           </w:pPr>
-          <w:hyperlink w:anchor="_Toc174535063" w:history="1">
+          <w:hyperlink w:anchor="_Toc176426912" w:history="1">
             <w:r>
               <w:rPr>
                 <w:rStyle w:val="Hyperlink"/>
@@ -173,7 +173,7 @@
                 <w:noProof/>
                 <w:webHidden/>
               </w:rPr>
-              <w:instrText xml:space="preserve"> PAGEREF _Toc174535063 \h </w:instrText>
+              <w:instrText xml:space="preserve"> PAGEREF _Toc176426912 \h </w:instrText>
             </w:r>
             <w:r>
               <w:rPr>
@@ -219,7 +219,7 @@
               <w14:ligatures w14:val="standardContextual"/>
             </w:rPr>
           </w:pPr>
-          <w:hyperlink w:anchor="_Toc174535064" w:history="1">
+          <w:hyperlink w:anchor="_Toc176426913" w:history="1">
             <w:r>
               <w:rPr>
                 <w:rStyle w:val="Hyperlink"/>
@@ -246,7 +246,7 @@
                 <w:noProof/>
                 <w:webHidden/>
               </w:rPr>
-              <w:instrText xml:space="preserve"> PAGEREF _Toc174535064 \h </w:instrText>
+              <w:instrText xml:space="preserve"> PAGEREF _Toc176426913 \h </w:instrText>
             </w:r>
             <w:r>
               <w:rPr>
@@ -292,7 +292,7 @@
               <w14:ligatures w14:val="standardContextual"/>
             </w:rPr>
           </w:pPr>
-          <w:hyperlink w:anchor="_Toc174535065" w:history="1">
+          <w:hyperlink w:anchor="_Toc176426914" w:history="1">
             <w:r>
               <w:rPr>
                 <w:rStyle w:val="Hyperlink"/>
@@ -319,7 +319,7 @@
                 <w:noProof/>
                 <w:webHidden/>
               </w:rPr>
-              <w:instrText xml:space="preserve"> PAGEREF _Toc174535065 \h </w:instrText>
+              <w:instrText xml:space="preserve"> PAGEREF _Toc176426914 \h </w:instrText>
             </w:r>
             <w:r>
               <w:rPr>
@@ -365,7 +365,7 @@
               <w14:ligatures w14:val="standardContextual"/>
             </w:rPr>
           </w:pPr>
-          <w:hyperlink w:anchor="_Toc174535066" w:history="1">
+          <w:hyperlink w:anchor="_Toc176426915" w:history="1">
             <w:r>
               <w:rPr>
                 <w:rStyle w:val="Hyperlink"/>
@@ -392,7 +392,7 @@
                 <w:noProof/>
                 <w:webHidden/>
               </w:rPr>
-              <w:instrText xml:space="preserve"> PAGEREF _Toc174535066 \h </w:instrText>
+              <w:instrText xml:space="preserve"> PAGEREF _Toc176426915 \h </w:instrText>
             </w:r>
             <w:r>
               <w:rPr>
@@ -438,7 +438,7 @@
               <w14:ligatures w14:val="standardContextual"/>
             </w:rPr>
           </w:pPr>
-          <w:hyperlink w:anchor="_Toc174535067" w:history="1">
+          <w:hyperlink w:anchor="_Toc176426916" w:history="1">
             <w:r>
               <w:rPr>
                 <w:rStyle w:val="Hyperlink"/>
@@ -465,7 +465,7 @@
                 <w:noProof/>
                 <w:webHidden/>
               </w:rPr>
-              <w:instrText xml:space="preserve"> PAGEREF _Toc174535067 \h </w:instrText>
+              <w:instrText xml:space="preserve"> PAGEREF _Toc176426916 \h </w:instrText>
             </w:r>
             <w:r>
               <w:rPr>
@@ -511,7 +511,7 @@
               <w14:ligatures w14:val="standardContextual"/>
             </w:rPr>
           </w:pPr>
-          <w:hyperlink w:anchor="_Toc174535068" w:history="1">
+          <w:hyperlink w:anchor="_Toc176426917" w:history="1">
             <w:r>
               <w:rPr>
                 <w:rStyle w:val="Hyperlink"/>
@@ -538,7 +538,7 @@
                 <w:noProof/>
                 <w:webHidden/>
               </w:rPr>
-              <w:instrText xml:space="preserve"> PAGEREF _Toc174535068 \h </w:instrText>
+              <w:instrText xml:space="preserve"> PAGEREF _Toc176426917 \h </w:instrText>
             </w:r>
             <w:r>
               <w:rPr>
@@ -559,6 +559,79 @@
                 <w:webHidden/>
               </w:rPr>
               <w:t>5</w:t>
+            </w:r>
+            <w:r>
+              <w:rPr>
+                <w:noProof/>
+                <w:webHidden/>
+              </w:rPr>
+              <w:fldChar w:fldCharType="end"/>
+            </w:r>
+          </w:hyperlink>
+        </w:p>
+        <w:p>
+          <w:pPr>
+            <w:pStyle w:val="TOC1"/>
+            <w:tabs>
+              <w:tab w:val="right" w:leader="dot" w:pos="9350"/>
+            </w:tabs>
+            <w:rPr>
+              <w:rFonts w:asciiTheme="minorHAnsi" w:eastAsiaTheme="minorEastAsia" w:hAnsiTheme="minorHAnsi"/>
+              <w:noProof/>
+              <w:kern w:val="2"/>
+              <w:sz w:val="24"/>
+              <w:lang w:val="en-GB" w:eastAsia="en-GB"/>
+              <w14:ligatures w14:val="standardContextual"/>
+            </w:rPr>
+          </w:pPr>
+          <w:hyperlink w:anchor="_Toc176426918" w:history="1">
+            <w:r>
+              <w:rPr>
+                <w:rStyle w:val="Hyperlink"/>
+                <w:noProof/>
+              </w:rPr>
+              <w:t>Workshop Instructions</w:t>
+            </w:r>
+            <w:r>
+              <w:rPr>
+                <w:noProof/>
+                <w:webHidden/>
+              </w:rPr>
+              <w:tab/>
+            </w:r>
+            <w:r>
+              <w:rPr>
+                <w:noProof/>
+                <w:webHidden/>
+              </w:rPr>
+              <w:fldChar w:fldCharType="begin"/>
+            </w:r>
+            <w:r>
+              <w:rPr>
+                <w:noProof/>
+                <w:webHidden/>
+              </w:rPr>
+              <w:instrText xml:space="preserve"> PAGEREF _Toc176426918 \h </w:instrText>
+            </w:r>
+            <w:r>
+              <w:rPr>
+                <w:noProof/>
+                <w:webHidden/>
+              </w:rPr>
+            </w:r>
+            <w:r>
+              <w:rPr>
+                <w:noProof/>
+                <w:webHidden/>
+              </w:rPr>
+              <w:fldChar w:fldCharType="separate"/>
+            </w:r>
+            <w:r>
+              <w:rPr>
+                <w:noProof/>
+                <w:webHidden/>
+              </w:rPr>
+              <w:t>6</w:t>
             </w:r>
             <w:r>
               <w:rPr>
@@ -584,13 +657,13 @@
               <w14:ligatures w14:val="standardContextual"/>
             </w:rPr>
           </w:pPr>
-          <w:hyperlink w:anchor="_Toc174535069" w:history="1">
+          <w:hyperlink w:anchor="_Toc176426919" w:history="1">
             <w:r>
               <w:rPr>
                 <w:rStyle w:val="Hyperlink"/>
                 <w:noProof/>
               </w:rPr>
-              <w:t>Basic R Commands</w:t>
+              <w:t>Set working directory</w:t>
             </w:r>
             <w:r>
               <w:rPr>
@@ -611,7 +684,7 @@
                 <w:noProof/>
                 <w:webHidden/>
               </w:rPr>
-              <w:instrText xml:space="preserve"> PAGEREF _Toc174535069 \h </w:instrText>
+              <w:instrText xml:space="preserve"> PAGEREF _Toc176426919 \h </w:instrText>
             </w:r>
             <w:r>
               <w:rPr>
@@ -657,13 +730,13 @@
               <w14:ligatures w14:val="standardContextual"/>
             </w:rPr>
           </w:pPr>
-          <w:hyperlink w:anchor="_Toc174535070" w:history="1">
+          <w:hyperlink w:anchor="_Toc176426920" w:history="1">
             <w:r>
               <w:rPr>
                 <w:rStyle w:val="Hyperlink"/>
                 <w:noProof/>
               </w:rPr>
-              <w:t>Using Functions</w:t>
+              <w:t>Download the File</w:t>
             </w:r>
             <w:r>
               <w:rPr>
@@ -684,7 +757,7 @@
                 <w:noProof/>
                 <w:webHidden/>
               </w:rPr>
-              <w:instrText xml:space="preserve"> PAGEREF _Toc174535070 \h </w:instrText>
+              <w:instrText xml:space="preserve"> PAGEREF _Toc176426920 \h </w:instrText>
             </w:r>
             <w:r>
               <w:rPr>
@@ -704,7 +777,226 @@
                 <w:noProof/>
                 <w:webHidden/>
               </w:rPr>
-              <w:t>6</w:t>
+              <w:t>7</w:t>
+            </w:r>
+            <w:r>
+              <w:rPr>
+                <w:noProof/>
+                <w:webHidden/>
+              </w:rPr>
+              <w:fldChar w:fldCharType="end"/>
+            </w:r>
+          </w:hyperlink>
+        </w:p>
+        <w:p>
+          <w:pPr>
+            <w:pStyle w:val="TOC2"/>
+            <w:tabs>
+              <w:tab w:val="right" w:leader="dot" w:pos="9350"/>
+            </w:tabs>
+            <w:rPr>
+              <w:rFonts w:asciiTheme="minorHAnsi" w:eastAsiaTheme="minorEastAsia" w:hAnsiTheme="minorHAnsi"/>
+              <w:noProof/>
+              <w:kern w:val="2"/>
+              <w:sz w:val="24"/>
+              <w:lang w:val="en-GB" w:eastAsia="en-GB"/>
+              <w14:ligatures w14:val="standardContextual"/>
+            </w:rPr>
+          </w:pPr>
+          <w:hyperlink w:anchor="_Toc176426921" w:history="1">
+            <w:r>
+              <w:rPr>
+                <w:rStyle w:val="Hyperlink"/>
+                <w:noProof/>
+              </w:rPr>
+              <w:t>Load File into RStudio</w:t>
+            </w:r>
+            <w:r>
+              <w:rPr>
+                <w:noProof/>
+                <w:webHidden/>
+              </w:rPr>
+              <w:tab/>
+            </w:r>
+            <w:r>
+              <w:rPr>
+                <w:noProof/>
+                <w:webHidden/>
+              </w:rPr>
+              <w:fldChar w:fldCharType="begin"/>
+            </w:r>
+            <w:r>
+              <w:rPr>
+                <w:noProof/>
+                <w:webHidden/>
+              </w:rPr>
+              <w:instrText xml:space="preserve"> PAGEREF _Toc176426921 \h </w:instrText>
+            </w:r>
+            <w:r>
+              <w:rPr>
+                <w:noProof/>
+                <w:webHidden/>
+              </w:rPr>
+            </w:r>
+            <w:r>
+              <w:rPr>
+                <w:noProof/>
+                <w:webHidden/>
+              </w:rPr>
+              <w:fldChar w:fldCharType="separate"/>
+            </w:r>
+            <w:r>
+              <w:rPr>
+                <w:noProof/>
+                <w:webHidden/>
+              </w:rPr>
+              <w:t>8</w:t>
+            </w:r>
+            <w:r>
+              <w:rPr>
+                <w:noProof/>
+                <w:webHidden/>
+              </w:rPr>
+              <w:fldChar w:fldCharType="end"/>
+            </w:r>
+          </w:hyperlink>
+        </w:p>
+        <w:p>
+          <w:pPr>
+            <w:pStyle w:val="TOC2"/>
+            <w:tabs>
+              <w:tab w:val="right" w:leader="dot" w:pos="9350"/>
+            </w:tabs>
+            <w:rPr>
+              <w:rFonts w:asciiTheme="minorHAnsi" w:eastAsiaTheme="minorEastAsia" w:hAnsiTheme="minorHAnsi"/>
+              <w:noProof/>
+              <w:kern w:val="2"/>
+              <w:sz w:val="24"/>
+              <w:lang w:val="en-GB" w:eastAsia="en-GB"/>
+              <w14:ligatures w14:val="standardContextual"/>
+            </w:rPr>
+          </w:pPr>
+          <w:hyperlink w:anchor="_Toc176426922" w:history="1">
+            <w:r>
+              <w:rPr>
+                <w:rStyle w:val="Hyperlink"/>
+                <w:noProof/>
+              </w:rPr>
+              <w:t>Checking It Worked</w:t>
+            </w:r>
+            <w:r>
+              <w:rPr>
+                <w:noProof/>
+                <w:webHidden/>
+              </w:rPr>
+              <w:tab/>
+            </w:r>
+            <w:r>
+              <w:rPr>
+                <w:noProof/>
+                <w:webHidden/>
+              </w:rPr>
+              <w:fldChar w:fldCharType="begin"/>
+            </w:r>
+            <w:r>
+              <w:rPr>
+                <w:noProof/>
+                <w:webHidden/>
+              </w:rPr>
+              <w:instrText xml:space="preserve"> PAGEREF _Toc176426922 \h </w:instrText>
+            </w:r>
+            <w:r>
+              <w:rPr>
+                <w:noProof/>
+                <w:webHidden/>
+              </w:rPr>
+            </w:r>
+            <w:r>
+              <w:rPr>
+                <w:noProof/>
+                <w:webHidden/>
+              </w:rPr>
+              <w:fldChar w:fldCharType="separate"/>
+            </w:r>
+            <w:r>
+              <w:rPr>
+                <w:noProof/>
+                <w:webHidden/>
+              </w:rPr>
+              <w:t>8</w:t>
+            </w:r>
+            <w:r>
+              <w:rPr>
+                <w:noProof/>
+                <w:webHidden/>
+              </w:rPr>
+              <w:fldChar w:fldCharType="end"/>
+            </w:r>
+          </w:hyperlink>
+        </w:p>
+        <w:p>
+          <w:pPr>
+            <w:pStyle w:val="TOC2"/>
+            <w:tabs>
+              <w:tab w:val="right" w:leader="dot" w:pos="9350"/>
+            </w:tabs>
+            <w:rPr>
+              <w:rFonts w:asciiTheme="minorHAnsi" w:eastAsiaTheme="minorEastAsia" w:hAnsiTheme="minorHAnsi"/>
+              <w:noProof/>
+              <w:kern w:val="2"/>
+              <w:sz w:val="24"/>
+              <w:lang w:val="en-GB" w:eastAsia="en-GB"/>
+              <w14:ligatures w14:val="standardContextual"/>
+            </w:rPr>
+          </w:pPr>
+          <w:hyperlink w:anchor="_Toc176426923" w:history="1">
+            <w:r>
+              <w:rPr>
+                <w:rStyle w:val="Hyperlink"/>
+                <w:noProof/>
+              </w:rPr>
+              <w:t>Question Set One</w:t>
+            </w:r>
+            <w:r>
+              <w:rPr>
+                <w:noProof/>
+                <w:webHidden/>
+              </w:rPr>
+              <w:tab/>
+            </w:r>
+            <w:r>
+              <w:rPr>
+                <w:noProof/>
+                <w:webHidden/>
+              </w:rPr>
+              <w:fldChar w:fldCharType="begin"/>
+            </w:r>
+            <w:r>
+              <w:rPr>
+                <w:noProof/>
+                <w:webHidden/>
+              </w:rPr>
+              <w:instrText xml:space="preserve"> PAGEREF _Toc176426923 \h </w:instrText>
+            </w:r>
+            <w:r>
+              <w:rPr>
+                <w:noProof/>
+                <w:webHidden/>
+              </w:rPr>
+            </w:r>
+            <w:r>
+              <w:rPr>
+                <w:noProof/>
+                <w:webHidden/>
+              </w:rPr>
+              <w:fldChar w:fldCharType="separate"/>
+            </w:r>
+            <w:r>
+              <w:rPr>
+                <w:noProof/>
+                <w:webHidden/>
+              </w:rPr>
+              <w:t>9</w:t>
             </w:r>
             <w:r>
               <w:rPr>
@@ -730,13 +1022,13 @@
               <w14:ligatures w14:val="standardContextual"/>
             </w:rPr>
           </w:pPr>
-          <w:hyperlink w:anchor="_Toc174535071" w:history="1">
+          <w:hyperlink w:anchor="_Toc176426924" w:history="1">
             <w:r>
               <w:rPr>
                 <w:rStyle w:val="Hyperlink"/>
                 <w:noProof/>
               </w:rPr>
-              <w:t>Workshop Instructions</w:t>
+              <w:t>Getting to Know the Data</w:t>
             </w:r>
             <w:r>
               <w:rPr>
@@ -757,7 +1049,7 @@
                 <w:noProof/>
                 <w:webHidden/>
               </w:rPr>
-              <w:instrText xml:space="preserve"> PAGEREF _Toc174535071 \h </w:instrText>
+              <w:instrText xml:space="preserve"> PAGEREF _Toc176426924 \h </w:instrText>
             </w:r>
             <w:r>
               <w:rPr>
@@ -777,7 +1069,7 @@
                 <w:noProof/>
                 <w:webHidden/>
               </w:rPr>
-              <w:t>7</w:t>
+              <w:t>9</w:t>
             </w:r>
             <w:r>
               <w:rPr>
@@ -803,13 +1095,13 @@
               <w14:ligatures w14:val="standardContextual"/>
             </w:rPr>
           </w:pPr>
-          <w:hyperlink w:anchor="_Toc174535072" w:history="1">
+          <w:hyperlink w:anchor="_Toc176426925" w:history="1">
             <w:r>
               <w:rPr>
                 <w:rStyle w:val="Hyperlink"/>
                 <w:noProof/>
               </w:rPr>
-              <w:t>Set working directory</w:t>
+              <w:t>Question Set Two</w:t>
             </w:r>
             <w:r>
               <w:rPr>
@@ -830,7 +1122,7 @@
                 <w:noProof/>
                 <w:webHidden/>
               </w:rPr>
-              <w:instrText xml:space="preserve"> PAGEREF _Toc174535072 \h </w:instrText>
+              <w:instrText xml:space="preserve"> PAGEREF _Toc176426925 \h </w:instrText>
             </w:r>
             <w:r>
               <w:rPr>
@@ -850,7 +1142,80 @@
                 <w:noProof/>
                 <w:webHidden/>
               </w:rPr>
-              <w:t>7</w:t>
+              <w:t>11</w:t>
+            </w:r>
+            <w:r>
+              <w:rPr>
+                <w:noProof/>
+                <w:webHidden/>
+              </w:rPr>
+              <w:fldChar w:fldCharType="end"/>
+            </w:r>
+          </w:hyperlink>
+        </w:p>
+        <w:p>
+          <w:pPr>
+            <w:pStyle w:val="TOC1"/>
+            <w:tabs>
+              <w:tab w:val="right" w:leader="dot" w:pos="9350"/>
+            </w:tabs>
+            <w:rPr>
+              <w:rFonts w:asciiTheme="minorHAnsi" w:eastAsiaTheme="minorEastAsia" w:hAnsiTheme="minorHAnsi"/>
+              <w:noProof/>
+              <w:kern w:val="2"/>
+              <w:sz w:val="24"/>
+              <w:lang w:val="en-GB" w:eastAsia="en-GB"/>
+              <w14:ligatures w14:val="standardContextual"/>
+            </w:rPr>
+          </w:pPr>
+          <w:hyperlink w:anchor="_Toc176426926" w:history="1">
+            <w:r>
+              <w:rPr>
+                <w:rStyle w:val="Hyperlink"/>
+                <w:noProof/>
+              </w:rPr>
+              <w:t>Data Detective</w:t>
+            </w:r>
+            <w:r>
+              <w:rPr>
+                <w:noProof/>
+                <w:webHidden/>
+              </w:rPr>
+              <w:tab/>
+            </w:r>
+            <w:r>
+              <w:rPr>
+                <w:noProof/>
+                <w:webHidden/>
+              </w:rPr>
+              <w:fldChar w:fldCharType="begin"/>
+            </w:r>
+            <w:r>
+              <w:rPr>
+                <w:noProof/>
+                <w:webHidden/>
+              </w:rPr>
+              <w:instrText xml:space="preserve"> PAGEREF _Toc176426926 \h </w:instrText>
+            </w:r>
+            <w:r>
+              <w:rPr>
+                <w:noProof/>
+                <w:webHidden/>
+              </w:rPr>
+            </w:r>
+            <w:r>
+              <w:rPr>
+                <w:noProof/>
+                <w:webHidden/>
+              </w:rPr>
+              <w:fldChar w:fldCharType="separate"/>
+            </w:r>
+            <w:r>
+              <w:rPr>
+                <w:noProof/>
+                <w:webHidden/>
+              </w:rPr>
+              <w:t>11</w:t>
             </w:r>
             <w:r>
               <w:rPr>
@@ -876,13 +1241,13 @@
               <w14:ligatures w14:val="standardContextual"/>
             </w:rPr>
           </w:pPr>
-          <w:hyperlink w:anchor="_Toc174535073" w:history="1">
+          <w:hyperlink w:anchor="_Toc176426927" w:history="1">
             <w:r>
               <w:rPr>
                 <w:rStyle w:val="Hyperlink"/>
                 <w:noProof/>
               </w:rPr>
-              <w:t>Download the File</w:t>
+              <w:t>Question Set Three</w:t>
             </w:r>
             <w:r>
               <w:rPr>
@@ -903,7 +1268,7 @@
                 <w:noProof/>
                 <w:webHidden/>
               </w:rPr>
-              <w:instrText xml:space="preserve"> PAGEREF _Toc174535073 \h </w:instrText>
+              <w:instrText xml:space="preserve"> PAGEREF _Toc176426927 \h </w:instrText>
             </w:r>
             <w:r>
               <w:rPr>
@@ -923,7 +1288,80 @@
                 <w:noProof/>
                 <w:webHidden/>
               </w:rPr>
-              <w:t>8</w:t>
+              <w:t>13</w:t>
+            </w:r>
+            <w:r>
+              <w:rPr>
+                <w:noProof/>
+                <w:webHidden/>
+              </w:rPr>
+              <w:fldChar w:fldCharType="end"/>
+            </w:r>
+          </w:hyperlink>
+        </w:p>
+        <w:p>
+          <w:pPr>
+            <w:pStyle w:val="TOC1"/>
+            <w:tabs>
+              <w:tab w:val="right" w:leader="dot" w:pos="9350"/>
+            </w:tabs>
+            <w:rPr>
+              <w:rFonts w:asciiTheme="minorHAnsi" w:eastAsiaTheme="minorEastAsia" w:hAnsiTheme="minorHAnsi"/>
+              <w:noProof/>
+              <w:kern w:val="2"/>
+              <w:sz w:val="24"/>
+              <w:lang w:val="en-GB" w:eastAsia="en-GB"/>
+              <w14:ligatures w14:val="standardContextual"/>
+            </w:rPr>
+          </w:pPr>
+          <w:hyperlink w:anchor="_Toc176426928" w:history="1">
+            <w:r>
+              <w:rPr>
+                <w:rStyle w:val="Hyperlink"/>
+                <w:noProof/>
+              </w:rPr>
+              <w:t>A More Refined Detective</w:t>
+            </w:r>
+            <w:r>
+              <w:rPr>
+                <w:noProof/>
+                <w:webHidden/>
+              </w:rPr>
+              <w:tab/>
+            </w:r>
+            <w:r>
+              <w:rPr>
+                <w:noProof/>
+                <w:webHidden/>
+              </w:rPr>
+              <w:fldChar w:fldCharType="begin"/>
+            </w:r>
+            <w:r>
+              <w:rPr>
+                <w:noProof/>
+                <w:webHidden/>
+              </w:rPr>
+              <w:instrText xml:space="preserve"> PAGEREF _Toc176426928 \h </w:instrText>
+            </w:r>
+            <w:r>
+              <w:rPr>
+                <w:noProof/>
+                <w:webHidden/>
+              </w:rPr>
+            </w:r>
+            <w:r>
+              <w:rPr>
+                <w:noProof/>
+                <w:webHidden/>
+              </w:rPr>
+              <w:fldChar w:fldCharType="separate"/>
+            </w:r>
+            <w:r>
+              <w:rPr>
+                <w:noProof/>
+                <w:webHidden/>
+              </w:rPr>
+              <w:t>13</w:t>
             </w:r>
             <w:r>
               <w:rPr>
@@ -949,13 +1387,13 @@
               <w14:ligatures w14:val="standardContextual"/>
             </w:rPr>
           </w:pPr>
-          <w:hyperlink w:anchor="_Toc174535074" w:history="1">
+          <w:hyperlink w:anchor="_Toc176426929" w:history="1">
             <w:r>
               <w:rPr>
                 <w:rStyle w:val="Hyperlink"/>
                 <w:noProof/>
               </w:rPr>
-              <w:t>Load File into RStudio</w:t>
+              <w:t>Question Set Four</w:t>
             </w:r>
             <w:r>
               <w:rPr>
@@ -976,7 +1414,7 @@
                 <w:noProof/>
                 <w:webHidden/>
               </w:rPr>
-              <w:instrText xml:space="preserve"> PAGEREF _Toc174535074 \h </w:instrText>
+              <w:instrText xml:space="preserve"> PAGEREF _Toc176426929 \h </w:instrText>
             </w:r>
             <w:r>
               <w:rPr>
@@ -996,7 +1434,80 @@
                 <w:noProof/>
                 <w:webHidden/>
               </w:rPr>
-              <w:t>9</w:t>
+              <w:t>14</w:t>
+            </w:r>
+            <w:r>
+              <w:rPr>
+                <w:noProof/>
+                <w:webHidden/>
+              </w:rPr>
+              <w:fldChar w:fldCharType="end"/>
+            </w:r>
+          </w:hyperlink>
+        </w:p>
+        <w:p>
+          <w:pPr>
+            <w:pStyle w:val="TOC1"/>
+            <w:tabs>
+              <w:tab w:val="right" w:leader="dot" w:pos="9350"/>
+            </w:tabs>
+            <w:rPr>
+              <w:rFonts w:asciiTheme="minorHAnsi" w:eastAsiaTheme="minorEastAsia" w:hAnsiTheme="minorHAnsi"/>
+              <w:noProof/>
+              <w:kern w:val="2"/>
+              <w:sz w:val="24"/>
+              <w:lang w:val="en-GB" w:eastAsia="en-GB"/>
+              <w14:ligatures w14:val="standardContextual"/>
+            </w:rPr>
+          </w:pPr>
+          <w:hyperlink w:anchor="_Toc176426930" w:history="1">
+            <w:r>
+              <w:rPr>
+                <w:rStyle w:val="Hyperlink"/>
+                <w:noProof/>
+              </w:rPr>
+              <w:t>Correcting Data</w:t>
+            </w:r>
+            <w:r>
+              <w:rPr>
+                <w:noProof/>
+                <w:webHidden/>
+              </w:rPr>
+              <w:tab/>
+            </w:r>
+            <w:r>
+              <w:rPr>
+                <w:noProof/>
+                <w:webHidden/>
+              </w:rPr>
+              <w:fldChar w:fldCharType="begin"/>
+            </w:r>
+            <w:r>
+              <w:rPr>
+                <w:noProof/>
+                <w:webHidden/>
+              </w:rPr>
+              <w:instrText xml:space="preserve"> PAGEREF _Toc176426930 \h </w:instrText>
+            </w:r>
+            <w:r>
+              <w:rPr>
+                <w:noProof/>
+                <w:webHidden/>
+              </w:rPr>
+            </w:r>
+            <w:r>
+              <w:rPr>
+                <w:noProof/>
+                <w:webHidden/>
+              </w:rPr>
+              <w:fldChar w:fldCharType="separate"/>
+            </w:r>
+            <w:r>
+              <w:rPr>
+                <w:noProof/>
+                <w:webHidden/>
+              </w:rPr>
+              <w:t>14</w:t>
             </w:r>
             <w:r>
               <w:rPr>
@@ -1022,13 +1533,13 @@
               <w14:ligatures w14:val="standardContextual"/>
             </w:rPr>
           </w:pPr>
-          <w:hyperlink w:anchor="_Toc174535075" w:history="1">
+          <w:hyperlink w:anchor="_Toc176426931" w:history="1">
             <w:r>
               <w:rPr>
                 <w:rStyle w:val="Hyperlink"/>
                 <w:noProof/>
               </w:rPr>
-              <w:t>Checking It Worked</w:t>
+              <w:t>Question Set Five</w:t>
             </w:r>
             <w:r>
               <w:rPr>
@@ -1049,7 +1560,7 @@
                 <w:noProof/>
                 <w:webHidden/>
               </w:rPr>
-              <w:instrText xml:space="preserve"> PAGEREF _Toc174535075 \h </w:instrText>
+              <w:instrText xml:space="preserve"> PAGEREF _Toc176426931 \h </w:instrText>
             </w:r>
             <w:r>
               <w:rPr>
@@ -1069,7 +1580,80 @@
                 <w:noProof/>
                 <w:webHidden/>
               </w:rPr>
-              <w:t>9</w:t>
+              <w:t>15</w:t>
+            </w:r>
+            <w:r>
+              <w:rPr>
+                <w:noProof/>
+                <w:webHidden/>
+              </w:rPr>
+              <w:fldChar w:fldCharType="end"/>
+            </w:r>
+          </w:hyperlink>
+        </w:p>
+        <w:p>
+          <w:pPr>
+            <w:pStyle w:val="TOC1"/>
+            <w:tabs>
+              <w:tab w:val="right" w:leader="dot" w:pos="9350"/>
+            </w:tabs>
+            <w:rPr>
+              <w:rFonts w:asciiTheme="minorHAnsi" w:eastAsiaTheme="minorEastAsia" w:hAnsiTheme="minorHAnsi"/>
+              <w:noProof/>
+              <w:kern w:val="2"/>
+              <w:sz w:val="24"/>
+              <w:lang w:val="en-GB" w:eastAsia="en-GB"/>
+              <w14:ligatures w14:val="standardContextual"/>
+            </w:rPr>
+          </w:pPr>
+          <w:hyperlink w:anchor="_Toc176426932" w:history="1">
+            <w:r>
+              <w:rPr>
+                <w:rStyle w:val="Hyperlink"/>
+                <w:noProof/>
+              </w:rPr>
+              <w:t>Do it for real</w:t>
+            </w:r>
+            <w:r>
+              <w:rPr>
+                <w:noProof/>
+                <w:webHidden/>
+              </w:rPr>
+              <w:tab/>
+            </w:r>
+            <w:r>
+              <w:rPr>
+                <w:noProof/>
+                <w:webHidden/>
+              </w:rPr>
+              <w:fldChar w:fldCharType="begin"/>
+            </w:r>
+            <w:r>
+              <w:rPr>
+                <w:noProof/>
+                <w:webHidden/>
+              </w:rPr>
+              <w:instrText xml:space="preserve"> PAGEREF _Toc176426932 \h </w:instrText>
+            </w:r>
+            <w:r>
+              <w:rPr>
+                <w:noProof/>
+                <w:webHidden/>
+              </w:rPr>
+            </w:r>
+            <w:r>
+              <w:rPr>
+                <w:noProof/>
+                <w:webHidden/>
+              </w:rPr>
+              <w:fldChar w:fldCharType="separate"/>
+            </w:r>
+            <w:r>
+              <w:rPr>
+                <w:noProof/>
+                <w:webHidden/>
+              </w:rPr>
+              <w:t>15</w:t>
             </w:r>
             <w:r>
               <w:rPr>
@@ -1095,13 +1679,13 @@
               <w14:ligatures w14:val="standardContextual"/>
             </w:rPr>
           </w:pPr>
-          <w:hyperlink w:anchor="_Toc174535076" w:history="1">
+          <w:hyperlink w:anchor="_Toc176426933" w:history="1">
             <w:r>
               <w:rPr>
                 <w:rStyle w:val="Hyperlink"/>
                 <w:noProof/>
               </w:rPr>
-              <w:t>Question Set One</w:t>
+              <w:t>Information about the dataset:</w:t>
             </w:r>
             <w:r>
               <w:rPr>
@@ -1122,7 +1706,7 @@
                 <w:noProof/>
                 <w:webHidden/>
               </w:rPr>
-              <w:instrText xml:space="preserve"> PAGEREF _Toc174535076 \h </w:instrText>
+              <w:instrText xml:space="preserve"> PAGEREF _Toc176426933 \h </w:instrText>
             </w:r>
             <w:r>
               <w:rPr>
@@ -1142,80 +1726,7 @@
                 <w:noProof/>
                 <w:webHidden/>
               </w:rPr>
-              <w:t>10</w:t>
-            </w:r>
-            <w:r>
-              <w:rPr>
-                <w:noProof/>
-                <w:webHidden/>
-              </w:rPr>
-              <w:fldChar w:fldCharType="end"/>
-            </w:r>
-          </w:hyperlink>
-        </w:p>
-        <w:p>
-          <w:pPr>
-            <w:pStyle w:val="TOC1"/>
-            <w:tabs>
-              <w:tab w:val="right" w:leader="dot" w:pos="9350"/>
-            </w:tabs>
-            <w:rPr>
-              <w:rFonts w:asciiTheme="minorHAnsi" w:eastAsiaTheme="minorEastAsia" w:hAnsiTheme="minorHAnsi"/>
-              <w:noProof/>
-              <w:kern w:val="2"/>
-              <w:sz w:val="24"/>
-              <w:lang w:val="en-GB" w:eastAsia="en-GB"/>
-              <w14:ligatures w14:val="standardContextual"/>
-            </w:rPr>
-          </w:pPr>
-          <w:hyperlink w:anchor="_Toc174535077" w:history="1">
-            <w:r>
-              <w:rPr>
-                <w:rStyle w:val="Hyperlink"/>
-                <w:noProof/>
-              </w:rPr>
-              <w:t>Getting to Know the Data</w:t>
-            </w:r>
-            <w:r>
-              <w:rPr>
-                <w:noProof/>
-                <w:webHidden/>
-              </w:rPr>
-              <w:tab/>
-            </w:r>
-            <w:r>
-              <w:rPr>
-                <w:noProof/>
-                <w:webHidden/>
-              </w:rPr>
-              <w:fldChar w:fldCharType="begin"/>
-            </w:r>
-            <w:r>
-              <w:rPr>
-                <w:noProof/>
-                <w:webHidden/>
-              </w:rPr>
-              <w:instrText xml:space="preserve"> PAGEREF _Toc174535077 \h </w:instrText>
-            </w:r>
-            <w:r>
-              <w:rPr>
-                <w:noProof/>
-                <w:webHidden/>
-              </w:rPr>
-            </w:r>
-            <w:r>
-              <w:rPr>
-                <w:noProof/>
-                <w:webHidden/>
-              </w:rPr>
-              <w:fldChar w:fldCharType="separate"/>
-            </w:r>
-            <w:r>
-              <w:rPr>
-                <w:noProof/>
-                <w:webHidden/>
-              </w:rPr>
-              <w:t>10</w:t>
+              <w:t>16</w:t>
             </w:r>
             <w:r>
               <w:rPr>
@@ -1241,13 +1752,13 @@
               <w14:ligatures w14:val="standardContextual"/>
             </w:rPr>
           </w:pPr>
-          <w:hyperlink w:anchor="_Toc174535078" w:history="1">
+          <w:hyperlink w:anchor="_Toc176426934" w:history="1">
             <w:r>
               <w:rPr>
                 <w:rStyle w:val="Hyperlink"/>
                 <w:noProof/>
               </w:rPr>
-              <w:t>Question Set Two</w:t>
+              <w:t>Question Set Six</w:t>
             </w:r>
             <w:r>
               <w:rPr>
@@ -1268,7 +1779,7 @@
                 <w:noProof/>
                 <w:webHidden/>
               </w:rPr>
-              <w:instrText xml:space="preserve"> PAGEREF _Toc174535078 \h </w:instrText>
+              <w:instrText xml:space="preserve"> PAGEREF _Toc176426934 \h </w:instrText>
             </w:r>
             <w:r>
               <w:rPr>
@@ -1288,591 +1799,7 @@
                 <w:noProof/>
                 <w:webHidden/>
               </w:rPr>
-              <w:t>12</w:t>
-            </w:r>
-            <w:r>
-              <w:rPr>
-                <w:noProof/>
-                <w:webHidden/>
-              </w:rPr>
-              <w:fldChar w:fldCharType="end"/>
-            </w:r>
-          </w:hyperlink>
-        </w:p>
-        <w:p>
-          <w:pPr>
-            <w:pStyle w:val="TOC1"/>
-            <w:tabs>
-              <w:tab w:val="right" w:leader="dot" w:pos="9350"/>
-            </w:tabs>
-            <w:rPr>
-              <w:rFonts w:asciiTheme="minorHAnsi" w:eastAsiaTheme="minorEastAsia" w:hAnsiTheme="minorHAnsi"/>
-              <w:noProof/>
-              <w:kern w:val="2"/>
-              <w:sz w:val="24"/>
-              <w:lang w:val="en-GB" w:eastAsia="en-GB"/>
-              <w14:ligatures w14:val="standardContextual"/>
-            </w:rPr>
-          </w:pPr>
-          <w:hyperlink w:anchor="_Toc174535079" w:history="1">
-            <w:r>
-              <w:rPr>
-                <w:rStyle w:val="Hyperlink"/>
-                <w:noProof/>
-              </w:rPr>
-              <w:t>Data Detective</w:t>
-            </w:r>
-            <w:r>
-              <w:rPr>
-                <w:noProof/>
-                <w:webHidden/>
-              </w:rPr>
-              <w:tab/>
-            </w:r>
-            <w:r>
-              <w:rPr>
-                <w:noProof/>
-                <w:webHidden/>
-              </w:rPr>
-              <w:fldChar w:fldCharType="begin"/>
-            </w:r>
-            <w:r>
-              <w:rPr>
-                <w:noProof/>
-                <w:webHidden/>
-              </w:rPr>
-              <w:instrText xml:space="preserve"> PAGEREF _Toc174535079 \h </w:instrText>
-            </w:r>
-            <w:r>
-              <w:rPr>
-                <w:noProof/>
-                <w:webHidden/>
-              </w:rPr>
-            </w:r>
-            <w:r>
-              <w:rPr>
-                <w:noProof/>
-                <w:webHidden/>
-              </w:rPr>
-              <w:fldChar w:fldCharType="separate"/>
-            </w:r>
-            <w:r>
-              <w:rPr>
-                <w:noProof/>
-                <w:webHidden/>
-              </w:rPr>
-              <w:t>12</w:t>
-            </w:r>
-            <w:r>
-              <w:rPr>
-                <w:noProof/>
-                <w:webHidden/>
-              </w:rPr>
-              <w:fldChar w:fldCharType="end"/>
-            </w:r>
-          </w:hyperlink>
-        </w:p>
-        <w:p>
-          <w:pPr>
-            <w:pStyle w:val="TOC2"/>
-            <w:tabs>
-              <w:tab w:val="right" w:leader="dot" w:pos="9350"/>
-            </w:tabs>
-            <w:rPr>
-              <w:rFonts w:asciiTheme="minorHAnsi" w:eastAsiaTheme="minorEastAsia" w:hAnsiTheme="minorHAnsi"/>
-              <w:noProof/>
-              <w:kern w:val="2"/>
-              <w:sz w:val="24"/>
-              <w:lang w:val="en-GB" w:eastAsia="en-GB"/>
-              <w14:ligatures w14:val="standardContextual"/>
-            </w:rPr>
-          </w:pPr>
-          <w:hyperlink w:anchor="_Toc174535080" w:history="1">
-            <w:r>
-              <w:rPr>
-                <w:rStyle w:val="Hyperlink"/>
-                <w:noProof/>
-              </w:rPr>
-              <w:t>Question Set Three</w:t>
-            </w:r>
-            <w:r>
-              <w:rPr>
-                <w:noProof/>
-                <w:webHidden/>
-              </w:rPr>
-              <w:tab/>
-            </w:r>
-            <w:r>
-              <w:rPr>
-                <w:noProof/>
-                <w:webHidden/>
-              </w:rPr>
-              <w:fldChar w:fldCharType="begin"/>
-            </w:r>
-            <w:r>
-              <w:rPr>
-                <w:noProof/>
-                <w:webHidden/>
-              </w:rPr>
-              <w:instrText xml:space="preserve"> PAGEREF _Toc174535080 \h </w:instrText>
-            </w:r>
-            <w:r>
-              <w:rPr>
-                <w:noProof/>
-                <w:webHidden/>
-              </w:rPr>
-            </w:r>
-            <w:r>
-              <w:rPr>
-                <w:noProof/>
-                <w:webHidden/>
-              </w:rPr>
-              <w:fldChar w:fldCharType="separate"/>
-            </w:r>
-            <w:r>
-              <w:rPr>
-                <w:noProof/>
-                <w:webHidden/>
-              </w:rPr>
-              <w:t>14</w:t>
-            </w:r>
-            <w:r>
-              <w:rPr>
-                <w:noProof/>
-                <w:webHidden/>
-              </w:rPr>
-              <w:fldChar w:fldCharType="end"/>
-            </w:r>
-          </w:hyperlink>
-        </w:p>
-        <w:p>
-          <w:pPr>
-            <w:pStyle w:val="TOC1"/>
-            <w:tabs>
-              <w:tab w:val="right" w:leader="dot" w:pos="9350"/>
-            </w:tabs>
-            <w:rPr>
-              <w:rFonts w:asciiTheme="minorHAnsi" w:eastAsiaTheme="minorEastAsia" w:hAnsiTheme="minorHAnsi"/>
-              <w:noProof/>
-              <w:kern w:val="2"/>
-              <w:sz w:val="24"/>
-              <w:lang w:val="en-GB" w:eastAsia="en-GB"/>
-              <w14:ligatures w14:val="standardContextual"/>
-            </w:rPr>
-          </w:pPr>
-          <w:hyperlink w:anchor="_Toc174535081" w:history="1">
-            <w:r>
-              <w:rPr>
-                <w:rStyle w:val="Hyperlink"/>
-                <w:noProof/>
-              </w:rPr>
-              <w:t>A More Refined Detective</w:t>
-            </w:r>
-            <w:r>
-              <w:rPr>
-                <w:noProof/>
-                <w:webHidden/>
-              </w:rPr>
-              <w:tab/>
-            </w:r>
-            <w:r>
-              <w:rPr>
-                <w:noProof/>
-                <w:webHidden/>
-              </w:rPr>
-              <w:fldChar w:fldCharType="begin"/>
-            </w:r>
-            <w:r>
-              <w:rPr>
-                <w:noProof/>
-                <w:webHidden/>
-              </w:rPr>
-              <w:instrText xml:space="preserve"> PAGEREF _Toc174535081 \h </w:instrText>
-            </w:r>
-            <w:r>
-              <w:rPr>
-                <w:noProof/>
-                <w:webHidden/>
-              </w:rPr>
-            </w:r>
-            <w:r>
-              <w:rPr>
-                <w:noProof/>
-                <w:webHidden/>
-              </w:rPr>
-              <w:fldChar w:fldCharType="separate"/>
-            </w:r>
-            <w:r>
-              <w:rPr>
-                <w:noProof/>
-                <w:webHidden/>
-              </w:rPr>
-              <w:t>14</w:t>
-            </w:r>
-            <w:r>
-              <w:rPr>
-                <w:noProof/>
-                <w:webHidden/>
-              </w:rPr>
-              <w:fldChar w:fldCharType="end"/>
-            </w:r>
-          </w:hyperlink>
-        </w:p>
-        <w:p>
-          <w:pPr>
-            <w:pStyle w:val="TOC2"/>
-            <w:tabs>
-              <w:tab w:val="right" w:leader="dot" w:pos="9350"/>
-            </w:tabs>
-            <w:rPr>
-              <w:rFonts w:asciiTheme="minorHAnsi" w:eastAsiaTheme="minorEastAsia" w:hAnsiTheme="minorHAnsi"/>
-              <w:noProof/>
-              <w:kern w:val="2"/>
-              <w:sz w:val="24"/>
-              <w:lang w:val="en-GB" w:eastAsia="en-GB"/>
-              <w14:ligatures w14:val="standardContextual"/>
-            </w:rPr>
-          </w:pPr>
-          <w:hyperlink w:anchor="_Toc174535082" w:history="1">
-            <w:r>
-              <w:rPr>
-                <w:rStyle w:val="Hyperlink"/>
-                <w:noProof/>
-              </w:rPr>
-              <w:t>Question Set Four</w:t>
-            </w:r>
-            <w:r>
-              <w:rPr>
-                <w:noProof/>
-                <w:webHidden/>
-              </w:rPr>
-              <w:tab/>
-            </w:r>
-            <w:r>
-              <w:rPr>
-                <w:noProof/>
-                <w:webHidden/>
-              </w:rPr>
-              <w:fldChar w:fldCharType="begin"/>
-            </w:r>
-            <w:r>
-              <w:rPr>
-                <w:noProof/>
-                <w:webHidden/>
-              </w:rPr>
-              <w:instrText xml:space="preserve"> PAGEREF _Toc174535082 \h </w:instrText>
-            </w:r>
-            <w:r>
-              <w:rPr>
-                <w:noProof/>
-                <w:webHidden/>
-              </w:rPr>
-            </w:r>
-            <w:r>
-              <w:rPr>
-                <w:noProof/>
-                <w:webHidden/>
-              </w:rPr>
-              <w:fldChar w:fldCharType="separate"/>
-            </w:r>
-            <w:r>
-              <w:rPr>
-                <w:noProof/>
-                <w:webHidden/>
-              </w:rPr>
-              <w:t>15</w:t>
-            </w:r>
-            <w:r>
-              <w:rPr>
-                <w:noProof/>
-                <w:webHidden/>
-              </w:rPr>
-              <w:fldChar w:fldCharType="end"/>
-            </w:r>
-          </w:hyperlink>
-        </w:p>
-        <w:p>
-          <w:pPr>
-            <w:pStyle w:val="TOC1"/>
-            <w:tabs>
-              <w:tab w:val="right" w:leader="dot" w:pos="9350"/>
-            </w:tabs>
-            <w:rPr>
-              <w:rFonts w:asciiTheme="minorHAnsi" w:eastAsiaTheme="minorEastAsia" w:hAnsiTheme="minorHAnsi"/>
-              <w:noProof/>
-              <w:kern w:val="2"/>
-              <w:sz w:val="24"/>
-              <w:lang w:val="en-GB" w:eastAsia="en-GB"/>
-              <w14:ligatures w14:val="standardContextual"/>
-            </w:rPr>
-          </w:pPr>
-          <w:hyperlink w:anchor="_Toc174535083" w:history="1">
-            <w:r>
-              <w:rPr>
-                <w:rStyle w:val="Hyperlink"/>
-                <w:noProof/>
-              </w:rPr>
-              <w:t>Correcting Data</w:t>
-            </w:r>
-            <w:r>
-              <w:rPr>
-                <w:noProof/>
-                <w:webHidden/>
-              </w:rPr>
-              <w:tab/>
-            </w:r>
-            <w:r>
-              <w:rPr>
-                <w:noProof/>
-                <w:webHidden/>
-              </w:rPr>
-              <w:fldChar w:fldCharType="begin"/>
-            </w:r>
-            <w:r>
-              <w:rPr>
-                <w:noProof/>
-                <w:webHidden/>
-              </w:rPr>
-              <w:instrText xml:space="preserve"> PAGEREF _Toc174535083 \h </w:instrText>
-            </w:r>
-            <w:r>
-              <w:rPr>
-                <w:noProof/>
-                <w:webHidden/>
-              </w:rPr>
-            </w:r>
-            <w:r>
-              <w:rPr>
-                <w:noProof/>
-                <w:webHidden/>
-              </w:rPr>
-              <w:fldChar w:fldCharType="separate"/>
-            </w:r>
-            <w:r>
-              <w:rPr>
-                <w:noProof/>
-                <w:webHidden/>
-              </w:rPr>
-              <w:t>15</w:t>
-            </w:r>
-            <w:r>
-              <w:rPr>
-                <w:noProof/>
-                <w:webHidden/>
-              </w:rPr>
-              <w:fldChar w:fldCharType="end"/>
-            </w:r>
-          </w:hyperlink>
-        </w:p>
-        <w:p>
-          <w:pPr>
-            <w:pStyle w:val="TOC2"/>
-            <w:tabs>
-              <w:tab w:val="right" w:leader="dot" w:pos="9350"/>
-            </w:tabs>
-            <w:rPr>
-              <w:rFonts w:asciiTheme="minorHAnsi" w:eastAsiaTheme="minorEastAsia" w:hAnsiTheme="minorHAnsi"/>
-              <w:noProof/>
-              <w:kern w:val="2"/>
-              <w:sz w:val="24"/>
-              <w:lang w:val="en-GB" w:eastAsia="en-GB"/>
-              <w14:ligatures w14:val="standardContextual"/>
-            </w:rPr>
-          </w:pPr>
-          <w:hyperlink w:anchor="_Toc174535084" w:history="1">
-            <w:r>
-              <w:rPr>
-                <w:rStyle w:val="Hyperlink"/>
-                <w:noProof/>
-              </w:rPr>
-              <w:t>Question Set Five</w:t>
-            </w:r>
-            <w:r>
-              <w:rPr>
-                <w:noProof/>
-                <w:webHidden/>
-              </w:rPr>
-              <w:tab/>
-            </w:r>
-            <w:r>
-              <w:rPr>
-                <w:noProof/>
-                <w:webHidden/>
-              </w:rPr>
-              <w:fldChar w:fldCharType="begin"/>
-            </w:r>
-            <w:r>
-              <w:rPr>
-                <w:noProof/>
-                <w:webHidden/>
-              </w:rPr>
-              <w:instrText xml:space="preserve"> PAGEREF _Toc174535084 \h </w:instrText>
-            </w:r>
-            <w:r>
-              <w:rPr>
-                <w:noProof/>
-                <w:webHidden/>
-              </w:rPr>
-            </w:r>
-            <w:r>
-              <w:rPr>
-                <w:noProof/>
-                <w:webHidden/>
-              </w:rPr>
-              <w:fldChar w:fldCharType="separate"/>
-            </w:r>
-            <w:r>
-              <w:rPr>
-                <w:noProof/>
-                <w:webHidden/>
-              </w:rPr>
               <w:t>16</w:t>
-            </w:r>
-            <w:r>
-              <w:rPr>
-                <w:noProof/>
-                <w:webHidden/>
-              </w:rPr>
-              <w:fldChar w:fldCharType="end"/>
-            </w:r>
-          </w:hyperlink>
-        </w:p>
-        <w:p>
-          <w:pPr>
-            <w:pStyle w:val="TOC1"/>
-            <w:tabs>
-              <w:tab w:val="right" w:leader="dot" w:pos="9350"/>
-            </w:tabs>
-            <w:rPr>
-              <w:rFonts w:asciiTheme="minorHAnsi" w:eastAsiaTheme="minorEastAsia" w:hAnsiTheme="minorHAnsi"/>
-              <w:noProof/>
-              <w:kern w:val="2"/>
-              <w:sz w:val="24"/>
-              <w:lang w:val="en-GB" w:eastAsia="en-GB"/>
-              <w14:ligatures w14:val="standardContextual"/>
-            </w:rPr>
-          </w:pPr>
-          <w:hyperlink w:anchor="_Toc174535085" w:history="1">
-            <w:r>
-              <w:rPr>
-                <w:rStyle w:val="Hyperlink"/>
-                <w:noProof/>
-              </w:rPr>
-              <w:t>Do it for real</w:t>
-            </w:r>
-            <w:r>
-              <w:rPr>
-                <w:noProof/>
-                <w:webHidden/>
-              </w:rPr>
-              <w:tab/>
-            </w:r>
-            <w:r>
-              <w:rPr>
-                <w:noProof/>
-                <w:webHidden/>
-              </w:rPr>
-              <w:fldChar w:fldCharType="begin"/>
-            </w:r>
-            <w:r>
-              <w:rPr>
-                <w:noProof/>
-                <w:webHidden/>
-              </w:rPr>
-              <w:instrText xml:space="preserve"> PAGEREF _Toc174535085 \h </w:instrText>
-            </w:r>
-            <w:r>
-              <w:rPr>
-                <w:noProof/>
-                <w:webHidden/>
-              </w:rPr>
-            </w:r>
-            <w:r>
-              <w:rPr>
-                <w:noProof/>
-                <w:webHidden/>
-              </w:rPr>
-              <w:fldChar w:fldCharType="separate"/>
-            </w:r>
-            <w:r>
-              <w:rPr>
-                <w:noProof/>
-                <w:webHidden/>
-              </w:rPr>
-              <w:t>16</w:t>
-            </w:r>
-            <w:r>
-              <w:rPr>
-                <w:noProof/>
-                <w:webHidden/>
-              </w:rPr>
-              <w:fldChar w:fldCharType="end"/>
-            </w:r>
-          </w:hyperlink>
-        </w:p>
-        <w:p>
-          <w:pPr>
-            <w:pStyle w:val="TOC2"/>
-            <w:tabs>
-              <w:tab w:val="right" w:leader="dot" w:pos="9350"/>
-            </w:tabs>
-            <w:rPr>
-              <w:rFonts w:asciiTheme="minorHAnsi" w:eastAsiaTheme="minorEastAsia" w:hAnsiTheme="minorHAnsi"/>
-              <w:noProof/>
-              <w:kern w:val="2"/>
-              <w:sz w:val="24"/>
-              <w:lang w:val="en-GB" w:eastAsia="en-GB"/>
-              <w14:ligatures w14:val="standardContextual"/>
-            </w:rPr>
-          </w:pPr>
-          <w:hyperlink w:anchor="_Toc174535086" w:history="1">
-            <w:r>
-              <w:rPr>
-                <w:rStyle w:val="Hyperlink"/>
-                <w:noProof/>
-              </w:rPr>
-              <w:t>Information about the dataset:</w:t>
-            </w:r>
-            <w:r>
-              <w:rPr>
-                <w:noProof/>
-                <w:webHidden/>
-              </w:rPr>
-              <w:tab/>
-            </w:r>
-            <w:r>
-              <w:rPr>
-                <w:noProof/>
-                <w:webHidden/>
-              </w:rPr>
-              <w:fldChar w:fldCharType="begin"/>
-            </w:r>
-            <w:r>
-              <w:rPr>
-                <w:noProof/>
-                <w:webHidden/>
-              </w:rPr>
-              <w:instrText xml:space="preserve"> PAGEREF _Toc174535086 \h </w:instrText>
-            </w:r>
-            <w:r>
-              <w:rPr>
-                <w:noProof/>
-                <w:webHidden/>
-              </w:rPr>
-            </w:r>
-            <w:r>
-              <w:rPr>
-                <w:noProof/>
-                <w:webHidden/>
-              </w:rPr>
-              <w:fldChar w:fldCharType="separate"/>
-            </w:r>
-            <w:r>
-              <w:rPr>
-                <w:noProof/>
-                <w:webHidden/>
-              </w:rPr>
-              <w:t>17</w:t>
             </w:r>
             <w:r>
               <w:rPr>
@@ -1895,7 +1822,7 @@
         <w:pStyle w:val="Heading1"/>
       </w:pPr>
       <w:bookmarkStart w:id="0" w:name="workshop-structure"/>
-      <w:bookmarkStart w:id="1" w:name="_Toc174535062"/>
+      <w:bookmarkStart w:id="1" w:name="_Toc176426911"/>
       <w:r>
         <w:lastRenderedPageBreak/>
         <w:t>Workshop Structure</w:t>
@@ -2025,7 +1952,7 @@
         <w:pStyle w:val="Heading1"/>
       </w:pPr>
       <w:bookmarkStart w:id="2" w:name="learning-objectives"/>
-      <w:bookmarkStart w:id="3" w:name="_Toc174535063"/>
+      <w:bookmarkStart w:id="3" w:name="_Toc176426912"/>
       <w:bookmarkEnd w:id="0"/>
       <w:r>
         <w:t>Learning Objectives</w:t>
@@ -2083,7 +2010,7 @@
         </w:numPr>
       </w:pPr>
       <w:r>
-        <w:t>Use the results of the EDA (Exploratory Data Analysis) to identify any issues;</w:t>
+        <w:t>Use the results of the EDA (Exploratory Data Analysis) to identify any issues in the data;</w:t>
       </w:r>
     </w:p>
     <w:p>
@@ -2129,7 +2056,7 @@
         <w:pStyle w:val="Heading1"/>
       </w:pPr>
       <w:bookmarkStart w:id="4" w:name="instruction-orientation"/>
-      <w:bookmarkStart w:id="5" w:name="_Toc174535064"/>
+      <w:bookmarkStart w:id="5" w:name="_Toc176426913"/>
       <w:bookmarkEnd w:id="2"/>
       <w:r>
         <w:t>Instruction Orientation</w:t>
@@ -2580,7 +2507,7 @@
         <w:pStyle w:val="Heading2"/>
       </w:pPr>
       <w:bookmarkStart w:id="6" w:name="commenting-guide"/>
-      <w:bookmarkStart w:id="7" w:name="_Toc174535065"/>
+      <w:bookmarkStart w:id="7" w:name="_Toc176426914"/>
       <w:r>
         <w:t>Commenting guide</w:t>
       </w:r>
@@ -3114,7 +3041,7 @@
         <w:pStyle w:val="Heading2"/>
       </w:pPr>
       <w:bookmarkStart w:id="8" w:name="on-using-llms"/>
-      <w:bookmarkStart w:id="9" w:name="_Toc174535066"/>
+      <w:bookmarkStart w:id="9" w:name="_Toc176426915"/>
       <w:bookmarkEnd w:id="6"/>
       <w:r>
         <w:t>On using LLMs</w:t>
@@ -3192,7 +3119,7 @@
         <w:pStyle w:val="Heading1"/>
       </w:pPr>
       <w:bookmarkStart w:id="10" w:name="getting-started-with-r"/>
-      <w:bookmarkStart w:id="11" w:name="_Toc174535067"/>
+      <w:bookmarkStart w:id="11" w:name="_Toc176426916"/>
       <w:bookmarkEnd w:id="4"/>
       <w:bookmarkEnd w:id="8"/>
       <w:r>
@@ -3299,7 +3226,7 @@
         </w:numPr>
       </w:pPr>
       <w:r>
-        <w:t>Source: This is where you write your scripts or RMarkdown documents.</w:t>
+        <w:t>Source: This is where you write your scripts.</w:t>
       </w:r>
     </w:p>
     <w:p>
@@ -3321,7 +3248,7 @@
         </w:numPr>
       </w:pPr>
       <w:r>
-        <w:t>Environment/History: This pane shows you the objects and functions that are currently stored in R’s memory.</w:t>
+        <w:t>Environment/History: This pane shows you the objects that are currently stored in R’s memory.</w:t>
       </w:r>
     </w:p>
     <w:p>
@@ -3340,7 +3267,7 @@
         <w:pStyle w:val="Heading2"/>
       </w:pPr>
       <w:bookmarkStart w:id="12" w:name="running-code"/>
-      <w:bookmarkStart w:id="13" w:name="_Toc174535068"/>
+      <w:bookmarkStart w:id="13" w:name="_Toc176426917"/>
       <w:r>
         <w:t>Running Code</w:t>
       </w:r>
@@ -3470,843 +3397,16 @@
     </w:p>
     <w:p>
       <w:pPr>
-        <w:pStyle w:val="Heading2"/>
-      </w:pPr>
-      <w:bookmarkStart w:id="14" w:name="basic-r-commands"/>
-      <w:bookmarkStart w:id="15" w:name="_Toc174535069"/>
+        <w:pStyle w:val="Heading1"/>
+      </w:pPr>
+      <w:bookmarkStart w:id="14" w:name="workshop-instructions"/>
+      <w:bookmarkStart w:id="15" w:name="_Toc176426918"/>
+      <w:bookmarkEnd w:id="10"/>
       <w:bookmarkEnd w:id="12"/>
       <w:r>
-        <w:t>Basic R Commands</w:t>
+        <w:t>Workshop Instructions</w:t>
       </w:r>
       <w:bookmarkEnd w:id="15"/>
-    </w:p>
-    <w:p>
-      <w:pPr>
-        <w:pStyle w:val="FirstParagraph"/>
-      </w:pPr>
-      <w:r>
-        <w:t xml:space="preserve">Let’s start with some basic </w:t>
-      </w:r>
-      <w:r>
-        <w:rPr>
-          <w:rStyle w:val="VerbatimChar"/>
-        </w:rPr>
-        <w:t>R</w:t>
-      </w:r>
-      <w:r>
-        <w:t xml:space="preserve"> commands to get you familiar with the console and scripting.</w:t>
-      </w:r>
-    </w:p>
-    <w:p>
-      <w:pPr>
-        <w:pStyle w:val="SourceCode"/>
-      </w:pPr>
-      <w:r>
-        <w:rPr>
-          <w:rStyle w:val="DecValTok"/>
-        </w:rPr>
-        <w:t>2</w:t>
-      </w:r>
-      <w:r>
-        <w:rPr>
-          <w:rStyle w:val="NormalTok"/>
-        </w:rPr>
-        <w:t xml:space="preserve"> </w:t>
-      </w:r>
-      <w:r>
-        <w:rPr>
-          <w:rStyle w:val="SpecialCharTok"/>
-        </w:rPr>
-        <w:t>+</w:t>
-      </w:r>
-      <w:r>
-        <w:rPr>
-          <w:rStyle w:val="NormalTok"/>
-        </w:rPr>
-        <w:t xml:space="preserve"> </w:t>
-      </w:r>
-      <w:r>
-        <w:rPr>
-          <w:rStyle w:val="DecValTok"/>
-        </w:rPr>
-        <w:t>2</w:t>
-      </w:r>
-      <w:r>
-        <w:rPr>
-          <w:rStyle w:val="NormalTok"/>
-        </w:rPr>
-        <w:t xml:space="preserve">       </w:t>
-      </w:r>
-      <w:r>
-        <w:rPr>
-          <w:rStyle w:val="CommentTok"/>
-        </w:rPr>
-        <w:t># Addition</w:t>
-      </w:r>
-      <w:r>
-        <w:br/>
-      </w:r>
-      <w:r>
-        <w:rPr>
-          <w:rStyle w:val="DecValTok"/>
-        </w:rPr>
-        <w:t>3</w:t>
-      </w:r>
-      <w:r>
-        <w:rPr>
-          <w:rStyle w:val="NormalTok"/>
-        </w:rPr>
-        <w:t xml:space="preserve"> </w:t>
-      </w:r>
-      <w:r>
-        <w:rPr>
-          <w:rStyle w:val="SpecialCharTok"/>
-        </w:rPr>
-        <w:t>-</w:t>
-      </w:r>
-      <w:r>
-        <w:rPr>
-          <w:rStyle w:val="NormalTok"/>
-        </w:rPr>
-        <w:t xml:space="preserve"> </w:t>
-      </w:r>
-      <w:r>
-        <w:rPr>
-          <w:rStyle w:val="DecValTok"/>
-        </w:rPr>
-        <w:t>1</w:t>
-      </w:r>
-      <w:r>
-        <w:rPr>
-          <w:rStyle w:val="NormalTok"/>
-        </w:rPr>
-        <w:t xml:space="preserve">       </w:t>
-      </w:r>
-      <w:r>
-        <w:rPr>
-          <w:rStyle w:val="CommentTok"/>
-        </w:rPr>
-        <w:t># Subtraction</w:t>
-      </w:r>
-      <w:r>
-        <w:br/>
-      </w:r>
-      <w:r>
-        <w:rPr>
-          <w:rStyle w:val="DecValTok"/>
-        </w:rPr>
-        <w:t>5</w:t>
-      </w:r>
-      <w:r>
-        <w:rPr>
-          <w:rStyle w:val="NormalTok"/>
-        </w:rPr>
-        <w:t xml:space="preserve"> </w:t>
-      </w:r>
-      <w:r>
-        <w:rPr>
-          <w:rStyle w:val="SpecialCharTok"/>
-        </w:rPr>
-        <w:t>*</w:t>
-      </w:r>
-      <w:r>
-        <w:rPr>
-          <w:rStyle w:val="NormalTok"/>
-        </w:rPr>
-        <w:t xml:space="preserve"> </w:t>
-      </w:r>
-      <w:r>
-        <w:rPr>
-          <w:rStyle w:val="DecValTok"/>
-        </w:rPr>
-        <w:t>3</w:t>
-      </w:r>
-      <w:r>
-        <w:rPr>
-          <w:rStyle w:val="NormalTok"/>
-        </w:rPr>
-        <w:t xml:space="preserve">       </w:t>
-      </w:r>
-      <w:r>
-        <w:rPr>
-          <w:rStyle w:val="CommentTok"/>
-        </w:rPr>
-        <w:t># Multiplication</w:t>
-      </w:r>
-      <w:r>
-        <w:br/>
-      </w:r>
-      <w:r>
-        <w:rPr>
-          <w:rStyle w:val="DecValTok"/>
-        </w:rPr>
-        <w:t>10</w:t>
-      </w:r>
-      <w:r>
-        <w:rPr>
-          <w:rStyle w:val="NormalTok"/>
-        </w:rPr>
-        <w:t xml:space="preserve"> </w:t>
-      </w:r>
-      <w:r>
-        <w:rPr>
-          <w:rStyle w:val="SpecialCharTok"/>
-        </w:rPr>
-        <w:t>/</w:t>
-      </w:r>
-      <w:r>
-        <w:rPr>
-          <w:rStyle w:val="NormalTok"/>
-        </w:rPr>
-        <w:t xml:space="preserve"> </w:t>
-      </w:r>
-      <w:r>
-        <w:rPr>
-          <w:rStyle w:val="DecValTok"/>
-        </w:rPr>
-        <w:t>2</w:t>
-      </w:r>
-      <w:r>
-        <w:rPr>
-          <w:rStyle w:val="NormalTok"/>
-        </w:rPr>
-        <w:t xml:space="preserve">      </w:t>
-      </w:r>
-      <w:r>
-        <w:rPr>
-          <w:rStyle w:val="CommentTok"/>
-        </w:rPr>
-        <w:t># Division</w:t>
-      </w:r>
-    </w:p>
-    <w:p>
-      <w:pPr>
-        <w:pStyle w:val="FirstParagraph"/>
-      </w:pPr>
-      <w:r>
-        <w:t xml:space="preserve">These are simple operations, but they illustrate the basic structure of </w:t>
-      </w:r>
-      <w:r>
-        <w:rPr>
-          <w:rStyle w:val="VerbatimChar"/>
-        </w:rPr>
-        <w:t>R</w:t>
-      </w:r>
-      <w:r>
-        <w:t xml:space="preserve"> code: functions and operators with arguments. For example, </w:t>
-      </w:r>
-      <w:r>
-        <w:rPr>
-          <w:rStyle w:val="VerbatimChar"/>
-        </w:rPr>
-        <w:t>+</w:t>
-      </w:r>
-      <w:r>
-        <w:t xml:space="preserve">, </w:t>
-      </w:r>
-      <w:r>
-        <w:rPr>
-          <w:rStyle w:val="VerbatimChar"/>
-        </w:rPr>
-        <w:t>-</w:t>
-      </w:r>
-      <w:r>
-        <w:t xml:space="preserve">, </w:t>
-      </w:r>
-      <w:r>
-        <w:rPr>
-          <w:rStyle w:val="VerbatimChar"/>
-        </w:rPr>
-        <w:t>*</w:t>
-      </w:r>
-      <w:r>
-        <w:t xml:space="preserve">, and </w:t>
-      </w:r>
-      <w:r>
-        <w:rPr>
-          <w:rStyle w:val="VerbatimChar"/>
-        </w:rPr>
-        <w:t>/</w:t>
-      </w:r>
-      <w:r>
-        <w:t xml:space="preserve"> are operators that take numbers as arguments and return their sum, difference, product, or quotient, respectively.</w:t>
-      </w:r>
-    </w:p>
-    <w:p>
-      <w:pPr>
-        <w:pStyle w:val="SourceCode"/>
-      </w:pPr>
-      <w:r>
-        <w:rPr>
-          <w:rStyle w:val="CommentTok"/>
-        </w:rPr>
-        <w:t># Assigning values to variables</w:t>
-      </w:r>
-      <w:r>
-        <w:br/>
-      </w:r>
-      <w:r>
-        <w:rPr>
-          <w:rStyle w:val="NormalTok"/>
-        </w:rPr>
-        <w:t xml:space="preserve">x </w:t>
-      </w:r>
-      <w:r>
-        <w:rPr>
-          <w:rStyle w:val="OtherTok"/>
-        </w:rPr>
-        <w:t>&lt;-</w:t>
-      </w:r>
-      <w:r>
-        <w:rPr>
-          <w:rStyle w:val="NormalTok"/>
-        </w:rPr>
-        <w:t xml:space="preserve"> </w:t>
-      </w:r>
-      <w:r>
-        <w:rPr>
-          <w:rStyle w:val="DecValTok"/>
-        </w:rPr>
-        <w:t>10</w:t>
-      </w:r>
-      <w:r>
-        <w:rPr>
-          <w:rStyle w:val="NormalTok"/>
-        </w:rPr>
-        <w:t xml:space="preserve">       </w:t>
-      </w:r>
-      <w:r>
-        <w:rPr>
-          <w:rStyle w:val="CommentTok"/>
-        </w:rPr>
-        <w:t># The arrow &lt;- is used for assignment</w:t>
-      </w:r>
-      <w:r>
-        <w:br/>
-      </w:r>
-      <w:r>
-        <w:rPr>
-          <w:rStyle w:val="NormalTok"/>
-        </w:rPr>
-        <w:t xml:space="preserve">y </w:t>
-      </w:r>
-      <w:r>
-        <w:rPr>
-          <w:rStyle w:val="OtherTok"/>
-        </w:rPr>
-        <w:t>&lt;-</w:t>
-      </w:r>
-      <w:r>
-        <w:rPr>
-          <w:rStyle w:val="NormalTok"/>
-        </w:rPr>
-        <w:t xml:space="preserve"> </w:t>
-      </w:r>
-      <w:r>
-        <w:rPr>
-          <w:rStyle w:val="DecValTok"/>
-        </w:rPr>
-        <w:t>5</w:t>
-      </w:r>
-      <w:r>
-        <w:br/>
-      </w:r>
-      <w:r>
-        <w:br/>
-      </w:r>
-      <w:r>
-        <w:rPr>
-          <w:rStyle w:val="CommentTok"/>
-        </w:rPr>
-        <w:t># Performing operations with variables</w:t>
-      </w:r>
-      <w:r>
-        <w:br/>
-      </w:r>
-      <w:r>
-        <w:rPr>
-          <w:rStyle w:val="NormalTok"/>
-        </w:rPr>
-        <w:t xml:space="preserve">z </w:t>
-      </w:r>
-      <w:r>
-        <w:rPr>
-          <w:rStyle w:val="OtherTok"/>
-        </w:rPr>
-        <w:t>&lt;-</w:t>
-      </w:r>
-      <w:r>
-        <w:rPr>
-          <w:rStyle w:val="NormalTok"/>
-        </w:rPr>
-        <w:t xml:space="preserve"> x </w:t>
-      </w:r>
-      <w:r>
-        <w:rPr>
-          <w:rStyle w:val="SpecialCharTok"/>
-        </w:rPr>
-        <w:t>+</w:t>
-      </w:r>
-      <w:r>
-        <w:rPr>
-          <w:rStyle w:val="NormalTok"/>
-        </w:rPr>
-        <w:t xml:space="preserve"> y</w:t>
-      </w:r>
-      <w:r>
-        <w:br/>
-      </w:r>
-      <w:r>
-        <w:rPr>
-          <w:rStyle w:val="NormalTok"/>
-        </w:rPr>
-        <w:t>z</w:t>
-      </w:r>
-    </w:p>
-    <w:p>
-      <w:pPr>
-        <w:pStyle w:val="FirstParagraph"/>
-      </w:pPr>
-      <w:r>
-        <w:t xml:space="preserve">In the code above, we assign the value 10 to the variable </w:t>
-      </w:r>
-      <w:r>
-        <w:rPr>
-          <w:rStyle w:val="VerbatimChar"/>
-        </w:rPr>
-        <w:t>x</w:t>
-      </w:r>
-      <w:r>
-        <w:t xml:space="preserve"> and the value 5 to the variable </w:t>
-      </w:r>
-      <w:r>
-        <w:rPr>
-          <w:rStyle w:val="VerbatimChar"/>
-        </w:rPr>
-        <w:t>y</w:t>
-      </w:r>
-      <w:r>
-        <w:t xml:space="preserve">. We then add </w:t>
-      </w:r>
-      <w:r>
-        <w:rPr>
-          <w:rStyle w:val="VerbatimChar"/>
-        </w:rPr>
-        <w:t>x</w:t>
-      </w:r>
-      <w:r>
-        <w:t xml:space="preserve"> and </w:t>
-      </w:r>
-      <w:r>
-        <w:rPr>
-          <w:rStyle w:val="VerbatimChar"/>
-        </w:rPr>
-        <w:t>y</w:t>
-      </w:r>
-      <w:r>
-        <w:t xml:space="preserve">, and store the result in a new variable </w:t>
-      </w:r>
-      <w:r>
-        <w:rPr>
-          <w:rStyle w:val="VerbatimChar"/>
-        </w:rPr>
-        <w:t>z</w:t>
-      </w:r>
-      <w:r>
-        <w:t>.</w:t>
-      </w:r>
-    </w:p>
-    <w:p>
-      <w:pPr>
-        <w:pStyle w:val="BodyText"/>
-      </w:pPr>
-      <w:r>
-        <w:t xml:space="preserve">Note: In </w:t>
-      </w:r>
-      <w:r>
-        <w:rPr>
-          <w:rStyle w:val="VerbatimChar"/>
-        </w:rPr>
-        <w:t>R</w:t>
-      </w:r>
-      <w:r>
-        <w:t xml:space="preserve">, </w:t>
-      </w:r>
-      <w:r>
-        <w:rPr>
-          <w:rStyle w:val="VerbatimChar"/>
-        </w:rPr>
-        <w:t>&lt;-</w:t>
-      </w:r>
-      <w:r>
-        <w:t xml:space="preserve"> is the preferred assignment operator. While </w:t>
-      </w:r>
-      <w:r>
-        <w:rPr>
-          <w:rStyle w:val="VerbatimChar"/>
-        </w:rPr>
-        <w:t>=</w:t>
-      </w:r>
-      <w:r>
-        <w:t xml:space="preserve"> can also be used, </w:t>
-      </w:r>
-      <w:r>
-        <w:rPr>
-          <w:rStyle w:val="VerbatimChar"/>
-        </w:rPr>
-        <w:t>&lt;-</w:t>
-      </w:r>
-      <w:r>
-        <w:t xml:space="preserve"> is more common and avoids some potential pitfalls in certain situations.</w:t>
-      </w:r>
-    </w:p>
-    <w:p>
-      <w:pPr>
-        <w:pStyle w:val="Heading2"/>
-      </w:pPr>
-      <w:bookmarkStart w:id="16" w:name="using-functions"/>
-      <w:bookmarkStart w:id="17" w:name="_Toc174535070"/>
-      <w:bookmarkEnd w:id="14"/>
-      <w:r>
-        <w:t>Using Functions</w:t>
-      </w:r>
-      <w:bookmarkEnd w:id="17"/>
-    </w:p>
-    <w:p>
-      <w:pPr>
-        <w:pStyle w:val="FirstParagraph"/>
-      </w:pPr>
-      <w:r>
-        <w:t xml:space="preserve">Functions are the workhorses of </w:t>
-      </w:r>
-      <w:r>
-        <w:rPr>
-          <w:rStyle w:val="VerbatimChar"/>
-        </w:rPr>
-        <w:t>R</w:t>
-      </w:r>
-      <w:r>
-        <w:t>. They take inputs (called arguments), perform some operations, and return a result. Let’s look at a basic example:</w:t>
-      </w:r>
-    </w:p>
-    <w:p>
-      <w:pPr>
-        <w:pStyle w:val="SourceCode"/>
-      </w:pPr>
-      <w:r>
-        <w:rPr>
-          <w:rStyle w:val="CommentTok"/>
-        </w:rPr>
-        <w:t># Using the sum() function</w:t>
-      </w:r>
-      <w:r>
-        <w:br/>
-      </w:r>
-      <w:r>
-        <w:rPr>
-          <w:rStyle w:val="NormalTok"/>
-        </w:rPr>
-        <w:t xml:space="preserve">total </w:t>
-      </w:r>
-      <w:r>
-        <w:rPr>
-          <w:rStyle w:val="OtherTok"/>
-        </w:rPr>
-        <w:t>&lt;-</w:t>
-      </w:r>
-      <w:r>
-        <w:rPr>
-          <w:rStyle w:val="NormalTok"/>
-        </w:rPr>
-        <w:t xml:space="preserve"> </w:t>
-      </w:r>
-      <w:r>
-        <w:rPr>
-          <w:rStyle w:val="FunctionTok"/>
-        </w:rPr>
-        <w:t>sum</w:t>
-      </w:r>
-      <w:r>
-        <w:rPr>
-          <w:rStyle w:val="NormalTok"/>
-        </w:rPr>
-        <w:t>(</w:t>
-      </w:r>
-      <w:r>
-        <w:rPr>
-          <w:rStyle w:val="DecValTok"/>
-        </w:rPr>
-        <w:t>1</w:t>
-      </w:r>
-      <w:r>
-        <w:rPr>
-          <w:rStyle w:val="NormalTok"/>
-        </w:rPr>
-        <w:t xml:space="preserve">, </w:t>
-      </w:r>
-      <w:r>
-        <w:rPr>
-          <w:rStyle w:val="DecValTok"/>
-        </w:rPr>
-        <w:t>2</w:t>
-      </w:r>
-      <w:r>
-        <w:rPr>
-          <w:rStyle w:val="NormalTok"/>
-        </w:rPr>
-        <w:t xml:space="preserve">, </w:t>
-      </w:r>
-      <w:r>
-        <w:rPr>
-          <w:rStyle w:val="DecValTok"/>
-        </w:rPr>
-        <w:t>3</w:t>
-      </w:r>
-      <w:r>
-        <w:rPr>
-          <w:rStyle w:val="NormalTok"/>
-        </w:rPr>
-        <w:t xml:space="preserve">, </w:t>
-      </w:r>
-      <w:r>
-        <w:rPr>
-          <w:rStyle w:val="DecValTok"/>
-        </w:rPr>
-        <w:t>4</w:t>
-      </w:r>
-      <w:r>
-        <w:rPr>
-          <w:rStyle w:val="NormalTok"/>
-        </w:rPr>
-        <w:t xml:space="preserve">, </w:t>
-      </w:r>
-      <w:r>
-        <w:rPr>
-          <w:rStyle w:val="DecValTok"/>
-        </w:rPr>
-        <w:t>5</w:t>
-      </w:r>
-      <w:r>
-        <w:rPr>
-          <w:rStyle w:val="NormalTok"/>
-        </w:rPr>
-        <w:t>)</w:t>
-      </w:r>
-      <w:r>
-        <w:br/>
-      </w:r>
-      <w:r>
-        <w:rPr>
-          <w:rStyle w:val="NormalTok"/>
-        </w:rPr>
-        <w:t>total</w:t>
-      </w:r>
-    </w:p>
-    <w:p>
-      <w:pPr>
-        <w:pStyle w:val="FirstParagraph"/>
-      </w:pPr>
-      <w:r>
-        <w:lastRenderedPageBreak/>
-        <w:t xml:space="preserve">In this case, the </w:t>
-      </w:r>
-      <w:r>
-        <w:rPr>
-          <w:rStyle w:val="VerbatimChar"/>
-        </w:rPr>
-        <w:t>sum()</w:t>
-      </w:r>
-      <w:r>
-        <w:t xml:space="preserve"> function takes several numbers as arguments and returns their sum. Functions often have multiple arguments, some of which are optional.</w:t>
-      </w:r>
-    </w:p>
-    <w:p>
-      <w:pPr>
-        <w:pStyle w:val="SourceCode"/>
-      </w:pPr>
-      <w:r>
-        <w:rPr>
-          <w:rStyle w:val="CommentTok"/>
-        </w:rPr>
-        <w:t># Using the mean() function with optional arguments</w:t>
-      </w:r>
-      <w:r>
-        <w:br/>
-      </w:r>
-      <w:r>
-        <w:rPr>
-          <w:rStyle w:val="NormalTok"/>
-        </w:rPr>
-        <w:t xml:space="preserve">average </w:t>
-      </w:r>
-      <w:r>
-        <w:rPr>
-          <w:rStyle w:val="OtherTok"/>
-        </w:rPr>
-        <w:t>&lt;-</w:t>
-      </w:r>
-      <w:r>
-        <w:rPr>
-          <w:rStyle w:val="NormalTok"/>
-        </w:rPr>
-        <w:t xml:space="preserve"> </w:t>
-      </w:r>
-      <w:r>
-        <w:rPr>
-          <w:rStyle w:val="FunctionTok"/>
-        </w:rPr>
-        <w:t>mean</w:t>
-      </w:r>
-      <w:r>
-        <w:rPr>
-          <w:rStyle w:val="NormalTok"/>
-        </w:rPr>
-        <w:t>(</w:t>
-      </w:r>
-      <w:r>
-        <w:rPr>
-          <w:rStyle w:val="FunctionTok"/>
-        </w:rPr>
-        <w:t>c</w:t>
-      </w:r>
-      <w:r>
-        <w:rPr>
-          <w:rStyle w:val="NormalTok"/>
-        </w:rPr>
-        <w:t>(</w:t>
-      </w:r>
-      <w:r>
-        <w:rPr>
-          <w:rStyle w:val="DecValTok"/>
-        </w:rPr>
-        <w:t>1</w:t>
-      </w:r>
-      <w:r>
-        <w:rPr>
-          <w:rStyle w:val="NormalTok"/>
-        </w:rPr>
-        <w:t xml:space="preserve">, </w:t>
-      </w:r>
-      <w:r>
-        <w:rPr>
-          <w:rStyle w:val="DecValTok"/>
-        </w:rPr>
-        <w:t>2</w:t>
-      </w:r>
-      <w:r>
-        <w:rPr>
-          <w:rStyle w:val="NormalTok"/>
-        </w:rPr>
-        <w:t xml:space="preserve">, </w:t>
-      </w:r>
-      <w:r>
-        <w:rPr>
-          <w:rStyle w:val="DecValTok"/>
-        </w:rPr>
-        <w:t>3</w:t>
-      </w:r>
-      <w:r>
-        <w:rPr>
-          <w:rStyle w:val="NormalTok"/>
-        </w:rPr>
-        <w:t xml:space="preserve">, </w:t>
-      </w:r>
-      <w:r>
-        <w:rPr>
-          <w:rStyle w:val="DecValTok"/>
-        </w:rPr>
-        <w:t>4</w:t>
-      </w:r>
-      <w:r>
-        <w:rPr>
-          <w:rStyle w:val="NormalTok"/>
-        </w:rPr>
-        <w:t xml:space="preserve">, </w:t>
-      </w:r>
-      <w:r>
-        <w:rPr>
-          <w:rStyle w:val="DecValTok"/>
-        </w:rPr>
-        <w:t>5</w:t>
-      </w:r>
-      <w:r>
-        <w:rPr>
-          <w:rStyle w:val="NormalTok"/>
-        </w:rPr>
-        <w:t xml:space="preserve">), </w:t>
-      </w:r>
-      <w:r>
-        <w:rPr>
-          <w:rStyle w:val="AttributeTok"/>
-        </w:rPr>
-        <w:t>na.rm =</w:t>
-      </w:r>
-      <w:r>
-        <w:rPr>
-          <w:rStyle w:val="NormalTok"/>
-        </w:rPr>
-        <w:t xml:space="preserve"> </w:t>
-      </w:r>
-      <w:r>
-        <w:rPr>
-          <w:rStyle w:val="ConstantTok"/>
-        </w:rPr>
-        <w:t>TRUE</w:t>
-      </w:r>
-      <w:r>
-        <w:rPr>
-          <w:rStyle w:val="NormalTok"/>
-        </w:rPr>
-        <w:t>)</w:t>
-      </w:r>
-      <w:r>
-        <w:br/>
-      </w:r>
-      <w:r>
-        <w:rPr>
-          <w:rStyle w:val="NormalTok"/>
-        </w:rPr>
-        <w:t>average</w:t>
-      </w:r>
-    </w:p>
-    <w:p>
-      <w:pPr>
-        <w:pStyle w:val="FirstParagraph"/>
-      </w:pPr>
-      <w:r>
-        <w:t xml:space="preserve">Here, the mean() function calculates the average of a vector of numbers. The argument </w:t>
-      </w:r>
-      <w:r>
-        <w:rPr>
-          <w:rStyle w:val="VerbatimChar"/>
-        </w:rPr>
-        <w:t>na.rm = TRUE</w:t>
-      </w:r>
-      <w:r>
-        <w:t xml:space="preserve"> tells R to ignore any </w:t>
-      </w:r>
-      <w:r>
-        <w:rPr>
-          <w:rStyle w:val="VerbatimChar"/>
-        </w:rPr>
-        <w:t>NA</w:t>
-      </w:r>
-      <w:r>
-        <w:t xml:space="preserve"> (missing) values when calculating the mean.</w:t>
-      </w:r>
-    </w:p>
-    <w:p>
-      <w:pPr>
-        <w:pStyle w:val="Heading1"/>
-      </w:pPr>
-      <w:bookmarkStart w:id="18" w:name="workshop-instructions"/>
-      <w:bookmarkStart w:id="19" w:name="_Toc174535071"/>
-      <w:bookmarkEnd w:id="10"/>
-      <w:bookmarkEnd w:id="16"/>
-      <w:r>
-        <w:t>Workshop Instructions</w:t>
-      </w:r>
-      <w:bookmarkEnd w:id="19"/>
     </w:p>
     <w:p>
       <w:pPr>
@@ -4383,12 +3483,12 @@
       <w:pPr>
         <w:pStyle w:val="Heading2"/>
       </w:pPr>
-      <w:bookmarkStart w:id="20" w:name="set-working-directory"/>
-      <w:bookmarkStart w:id="21" w:name="_Toc174535072"/>
+      <w:bookmarkStart w:id="16" w:name="set-working-directory"/>
+      <w:bookmarkStart w:id="17" w:name="_Toc176426919"/>
       <w:r>
         <w:t>Set working directory</w:t>
       </w:r>
-      <w:bookmarkEnd w:id="21"/>
+      <w:bookmarkEnd w:id="17"/>
     </w:p>
     <w:p>
       <w:pPr>
@@ -4483,6 +3583,7 @@
         <w:pStyle w:val="BodyText"/>
       </w:pPr>
       <w:r>
+        <w:lastRenderedPageBreak/>
         <w:t>With your script now open, to set the working directory to the folder you want to use for saving your work, you have two options:</w:t>
       </w:r>
     </w:p>
@@ -4503,7 +3604,6 @@
         <w:pStyle w:val="BodyText"/>
       </w:pPr>
       <w:r>
-        <w:lastRenderedPageBreak/>
         <w:t>Find the file path for your newly created folder (e.g. </w:t>
       </w:r>
       <w:r>
@@ -4803,13 +3903,13 @@
       <w:pPr>
         <w:pStyle w:val="Heading2"/>
       </w:pPr>
-      <w:bookmarkStart w:id="22" w:name="download-the-file"/>
-      <w:bookmarkStart w:id="23" w:name="_Toc174535073"/>
-      <w:bookmarkEnd w:id="20"/>
+      <w:bookmarkStart w:id="18" w:name="download-the-file"/>
+      <w:bookmarkStart w:id="19" w:name="_Toc176426920"/>
+      <w:bookmarkEnd w:id="16"/>
       <w:r>
         <w:t>Download the File</w:t>
       </w:r>
-      <w:bookmarkEnd w:id="23"/>
+      <w:bookmarkEnd w:id="19"/>
     </w:p>
     <w:p>
       <w:pPr>
@@ -4828,6 +3928,7 @@
         <w:pStyle w:val="BodyText"/>
       </w:pPr>
       <w:r>
+        <w:lastRenderedPageBreak/>
         <w:t xml:space="preserve">On MyAberdeen in the Tuesday - Workshop folder within Week 1, you’ll find a file called </w:t>
       </w:r>
       <w:r>
@@ -4861,14 +3962,13 @@
       <w:pPr>
         <w:pStyle w:val="Heading2"/>
       </w:pPr>
-      <w:bookmarkStart w:id="24" w:name="load-file-into-rstudio"/>
-      <w:bookmarkStart w:id="25" w:name="_Toc174535074"/>
-      <w:bookmarkEnd w:id="22"/>
-      <w:r>
-        <w:lastRenderedPageBreak/>
+      <w:bookmarkStart w:id="20" w:name="load-file-into-rstudio"/>
+      <w:bookmarkStart w:id="21" w:name="_Toc176426921"/>
+      <w:bookmarkEnd w:id="18"/>
+      <w:r>
         <w:t>Load File into RStudio</w:t>
       </w:r>
-      <w:bookmarkEnd w:id="25"/>
+      <w:bookmarkEnd w:id="21"/>
     </w:p>
     <w:p>
       <w:pPr>
@@ -5174,13 +4274,13 @@
       <w:pPr>
         <w:pStyle w:val="Heading2"/>
       </w:pPr>
-      <w:bookmarkStart w:id="26" w:name="checking-it-worked"/>
-      <w:bookmarkStart w:id="27" w:name="_Toc174535075"/>
-      <w:bookmarkEnd w:id="24"/>
+      <w:bookmarkStart w:id="22" w:name="checking-it-worked"/>
+      <w:bookmarkStart w:id="23" w:name="_Toc176426922"/>
+      <w:bookmarkEnd w:id="20"/>
       <w:r>
         <w:t>Checking It Worked</w:t>
       </w:r>
-      <w:bookmarkEnd w:id="27"/>
+      <w:bookmarkEnd w:id="23"/>
     </w:p>
     <w:p>
       <w:pPr>
@@ -5306,6 +4406,7 @@
         </w:numPr>
       </w:pPr>
       <w:r>
+        <w:lastRenderedPageBreak/>
         <w:t xml:space="preserve">You may have missed the final bracket </w:t>
       </w:r>
       <w:r>
@@ -5357,7 +4458,6 @@
         <w:pStyle w:val="BodyText"/>
       </w:pPr>
       <w:r>
-        <w:lastRenderedPageBreak/>
         <w:t xml:space="preserve">The following will show you the first six rows of your dataset (you can change how many rows are shown by using the </w:t>
       </w:r>
       <w:r>
@@ -5469,13 +4569,13 @@
       <w:pPr>
         <w:pStyle w:val="Heading2"/>
       </w:pPr>
-      <w:bookmarkStart w:id="28" w:name="question-set-one"/>
-      <w:bookmarkStart w:id="29" w:name="_Toc174535076"/>
-      <w:bookmarkEnd w:id="26"/>
+      <w:bookmarkStart w:id="24" w:name="question-set-one"/>
+      <w:bookmarkStart w:id="25" w:name="_Toc176426923"/>
+      <w:bookmarkEnd w:id="22"/>
       <w:r>
         <w:t>Question Set One</w:t>
       </w:r>
-      <w:bookmarkEnd w:id="29"/>
+      <w:bookmarkEnd w:id="25"/>
     </w:p>
     <w:p>
       <w:pPr>
@@ -5522,14 +4622,14 @@
       <w:pPr>
         <w:pStyle w:val="Heading1"/>
       </w:pPr>
-      <w:bookmarkStart w:id="30" w:name="getting-to-know-the-data"/>
-      <w:bookmarkStart w:id="31" w:name="_Toc174535077"/>
-      <w:bookmarkEnd w:id="18"/>
-      <w:bookmarkEnd w:id="28"/>
+      <w:bookmarkStart w:id="26" w:name="getting-to-know-the-data"/>
+      <w:bookmarkStart w:id="27" w:name="_Toc176426924"/>
+      <w:bookmarkEnd w:id="14"/>
+      <w:bookmarkEnd w:id="24"/>
       <w:r>
         <w:t>Getting to Know the Data</w:t>
       </w:r>
-      <w:bookmarkEnd w:id="31"/>
+      <w:bookmarkEnd w:id="27"/>
     </w:p>
     <w:p>
       <w:pPr>
@@ -5598,6 +4698,7 @@
         <w:pStyle w:val="BodyText"/>
       </w:pPr>
       <w:r>
+        <w:lastRenderedPageBreak/>
         <w:t>Write down the average bite strength of an alligator, measured in pounds per square inch, and the average length of an alligator in centimeters (ideally as a comment in your script).</w:t>
       </w:r>
     </w:p>
@@ -5615,11 +4716,7 @@
         <w:t>R</w:t>
       </w:r>
       <w:r>
-        <w:t xml:space="preserve">, this means that numbers are numbers, words are characters (or sometimes factors), and so on. Basically, we want to make sure there aren’t any bite </w:t>
-      </w:r>
-      <w:r>
-        <w:lastRenderedPageBreak/>
-        <w:t xml:space="preserve">measurements like </w:t>
+        <w:t xml:space="preserve">, this means that numbers are numbers, words are characters (or sometimes factors), and so on. Basically, we want to make sure there aren’t any bite measurements like </w:t>
       </w:r>
       <w:r>
         <w:rPr>
@@ -5996,6 +5093,7 @@
         <w:pStyle w:val="BodyText"/>
       </w:pPr>
       <w:r>
+        <w:lastRenderedPageBreak/>
         <w:t xml:space="preserve">This is something that should make us sit up and pay attention. We don’t know for sure if there’s a problem, but we have reason to believe there </w:t>
       </w:r>
       <w:r>
@@ -6033,11 +5131,7 @@
         <w:t>summary()</w:t>
       </w:r>
       <w:r>
-        <w:t xml:space="preserve"> function. This function provides a generic summary of our </w:t>
-      </w:r>
-      <w:r>
-        <w:lastRenderedPageBreak/>
-        <w:t xml:space="preserve">entire dataset when we supply </w:t>
+        <w:t xml:space="preserve"> function. This function provides a generic summary of our entire dataset when we supply </w:t>
       </w:r>
       <w:r>
         <w:rPr>
@@ -6071,7 +5165,7 @@
         <w:pStyle w:val="FirstParagraph"/>
       </w:pPr>
       <w:r>
-        <w:t xml:space="preserve">Keep in mind, with EDA where looking for anything </w:t>
+        <w:t xml:space="preserve">Keep in mind, with EDA we’re looking for anything </w:t>
       </w:r>
       <w:r>
         <w:rPr>
@@ -6088,12 +5182,12 @@
       <w:pPr>
         <w:pStyle w:val="Heading2"/>
       </w:pPr>
-      <w:bookmarkStart w:id="32" w:name="question-set-two"/>
-      <w:bookmarkStart w:id="33" w:name="_Toc174535078"/>
+      <w:bookmarkStart w:id="28" w:name="question-set-two"/>
+      <w:bookmarkStart w:id="29" w:name="_Toc176426925"/>
       <w:r>
         <w:t>Question Set Two</w:t>
       </w:r>
-      <w:bookmarkEnd w:id="33"/>
+      <w:bookmarkEnd w:id="29"/>
     </w:p>
     <w:p>
       <w:pPr>
@@ -6123,14 +5217,14 @@
       <w:pPr>
         <w:pStyle w:val="Heading1"/>
       </w:pPr>
-      <w:bookmarkStart w:id="34" w:name="data-detective"/>
-      <w:bookmarkStart w:id="35" w:name="_Toc174535079"/>
-      <w:bookmarkEnd w:id="30"/>
-      <w:bookmarkEnd w:id="32"/>
+      <w:bookmarkStart w:id="30" w:name="data-detective"/>
+      <w:bookmarkStart w:id="31" w:name="_Toc176426926"/>
+      <w:bookmarkEnd w:id="26"/>
+      <w:bookmarkEnd w:id="28"/>
       <w:r>
         <w:t>Data Detective</w:t>
       </w:r>
-      <w:bookmarkEnd w:id="35"/>
+      <w:bookmarkEnd w:id="31"/>
     </w:p>
     <w:p>
       <w:pPr>
@@ -6279,6 +5373,7 @@
         </w:numPr>
       </w:pPr>
       <w:r>
+        <w:lastRenderedPageBreak/>
         <w:t xml:space="preserve">We’d start by looking at the </w:t>
       </w:r>
       <w:r>
@@ -6328,7 +5423,6 @@
         <w:pStyle w:val="FirstParagraph"/>
       </w:pPr>
       <w:r>
-        <w:lastRenderedPageBreak/>
         <w:t xml:space="preserve">This is where we can use square brackets </w:t>
       </w:r>
       <w:r>
@@ -6738,6 +5832,7 @@
         <w:pStyle w:val="FirstParagraph"/>
       </w:pPr>
       <w:r>
+        <w:lastRenderedPageBreak/>
         <w:t xml:space="preserve">This command extracts the data from the first row of the </w:t>
       </w:r>
       <w:r>
@@ -6755,18 +5850,565 @@
         <w:pStyle w:val="BodyText"/>
       </w:pPr>
       <w:r>
+        <w:t>Well, they’re clearly different. The first alligator in our dataset looks pretty normal. Maybe a bit on the big side, but not weirdly so. There are only two possible explanations for this. Either there are giant alligators among us. Or, there has been a data entry mistake.</w:t>
+      </w:r>
+    </w:p>
+    <w:p>
+      <w:pPr>
+        <w:pStyle w:val="Heading2"/>
+      </w:pPr>
+      <w:bookmarkStart w:id="32" w:name="question-set-three"/>
+      <w:bookmarkStart w:id="33" w:name="_Toc176426927"/>
+      <w:r>
+        <w:t>Question Set Three</w:t>
+      </w:r>
+      <w:bookmarkEnd w:id="33"/>
+    </w:p>
+    <w:p>
+      <w:pPr>
+        <w:pStyle w:val="FirstParagraph"/>
+      </w:pPr>
+      <w:r>
+        <w:t>Question 1. What may have occurred to have caused this apparent data entry mistake?</w:t>
+      </w:r>
+    </w:p>
+    <w:p>
+      <w:pPr>
+        <w:pStyle w:val="Heading1"/>
+      </w:pPr>
+      <w:bookmarkStart w:id="34" w:name="a-more-refined-detective"/>
+      <w:bookmarkStart w:id="35" w:name="_Toc176426928"/>
+      <w:bookmarkEnd w:id="30"/>
+      <w:bookmarkEnd w:id="32"/>
+      <w:r>
+        <w:t>A More Refined Detective</w:t>
+      </w:r>
+      <w:bookmarkEnd w:id="35"/>
+    </w:p>
+    <w:p>
+      <w:pPr>
+        <w:pStyle w:val="FirstParagraph"/>
+      </w:pPr>
+      <w:r>
+        <w:t>The method we used to identify the data entry mistake is effective, but what if we want to be a more refined programmer and avoid repeatedly writing out 2293?</w:t>
+      </w:r>
+    </w:p>
+    <w:p>
+      <w:pPr>
+        <w:pStyle w:val="BodyText"/>
+      </w:pPr>
+      <w:r>
+        <w:t xml:space="preserve">Instead, we can use a function that returns the maximum alligator length. The function to do just that is called </w:t>
+      </w:r>
+      <w:r>
+        <w:rPr>
+          <w:rStyle w:val="VerbatimChar"/>
+        </w:rPr>
+        <w:t>max()</w:t>
+      </w:r>
+      <w:r>
+        <w:t>:</w:t>
+      </w:r>
+    </w:p>
+    <w:p>
+      <w:pPr>
+        <w:pStyle w:val="SourceCode"/>
+      </w:pPr>
+      <w:r>
+        <w:rPr>
+          <w:rStyle w:val="CommentTok"/>
+        </w:rPr>
+        <w:t># Get the maximum alligator length</w:t>
+      </w:r>
+      <w:r>
+        <w:br/>
+      </w:r>
+      <w:r>
+        <w:rPr>
+          <w:rStyle w:val="NormalTok"/>
+        </w:rPr>
+        <w:t xml:space="preserve">max_length </w:t>
+      </w:r>
+      <w:r>
+        <w:rPr>
+          <w:rStyle w:val="OtherTok"/>
+        </w:rPr>
+        <w:t>&lt;-</w:t>
+      </w:r>
+      <w:r>
+        <w:rPr>
+          <w:rStyle w:val="NormalTok"/>
+        </w:rPr>
+        <w:t xml:space="preserve"> </w:t>
+      </w:r>
+      <w:r>
+        <w:rPr>
+          <w:rStyle w:val="FunctionTok"/>
+        </w:rPr>
+        <w:t>max</w:t>
+      </w:r>
+      <w:r>
+        <w:rPr>
+          <w:rStyle w:val="NormalTok"/>
+        </w:rPr>
+        <w:t>(ali</w:t>
+      </w:r>
+      <w:r>
+        <w:rPr>
+          <w:rStyle w:val="SpecialCharTok"/>
+        </w:rPr>
+        <w:t>$</w:t>
+      </w:r>
+      <w:r>
+        <w:rPr>
+          <w:rStyle w:val="NormalTok"/>
+        </w:rPr>
+        <w:t>length)</w:t>
+      </w:r>
+      <w:r>
+        <w:br/>
+      </w:r>
+      <w:r>
+        <w:br/>
+      </w:r>
+      <w:r>
+        <w:rPr>
+          <w:rStyle w:val="CommentTok"/>
+        </w:rPr>
+        <w:t># Now use this value to find the problematic rows</w:t>
+      </w:r>
+      <w:r>
+        <w:br/>
+      </w:r>
+      <w:r>
+        <w:rPr>
+          <w:rStyle w:val="NormalTok"/>
+        </w:rPr>
+        <w:t>ali[ali</w:t>
+      </w:r>
+      <w:r>
+        <w:rPr>
+          <w:rStyle w:val="SpecialCharTok"/>
+        </w:rPr>
+        <w:t>$</w:t>
+      </w:r>
+      <w:r>
+        <w:rPr>
+          <w:rStyle w:val="NormalTok"/>
+        </w:rPr>
+        <w:t xml:space="preserve">length </w:t>
+      </w:r>
+      <w:r>
+        <w:rPr>
+          <w:rStyle w:val="SpecialCharTok"/>
+        </w:rPr>
+        <w:t>==</w:t>
+      </w:r>
+      <w:r>
+        <w:rPr>
+          <w:rStyle w:val="NormalTok"/>
+        </w:rPr>
+        <w:t xml:space="preserve"> max_length, ]</w:t>
+      </w:r>
+    </w:p>
+    <w:p>
+      <w:pPr>
+        <w:pStyle w:val="FirstParagraph"/>
+      </w:pPr>
+      <w:r>
+        <w:t xml:space="preserve">By storing the result of </w:t>
+      </w:r>
+      <w:r>
+        <w:rPr>
+          <w:rStyle w:val="VerbatimChar"/>
+        </w:rPr>
+        <w:t>max(ali$length)</w:t>
+      </w:r>
+      <w:r>
+        <w:t xml:space="preserve"> in a variable (</w:t>
+      </w:r>
+      <w:r>
+        <w:rPr>
+          <w:rStyle w:val="VerbatimChar"/>
+        </w:rPr>
+        <w:t>max_length</w:t>
+      </w:r>
+      <w:r>
+        <w:t xml:space="preserve">), we can simplify our code and make it more readable. This way, if we need to refer to the maximum length multiple times, we only need to use the </w:t>
+      </w:r>
+      <w:r>
+        <w:rPr>
+          <w:rStyle w:val="VerbatimChar"/>
+        </w:rPr>
+        <w:t>max_length</w:t>
+      </w:r>
+      <w:r>
+        <w:t xml:space="preserve"> variable. Within the </w:t>
+      </w:r>
+      <w:r>
+        <w:rPr>
+          <w:rStyle w:val="VerbatimChar"/>
+        </w:rPr>
+        <w:t>ali</w:t>
+      </w:r>
+      <w:r>
+        <w:t xml:space="preserve"> dataset, this code extracts all columns (since we have not specified anything after the comma in the square brackets) for any rows where the length of an alligator is equal to the maximum length of any alligator.</w:t>
+      </w:r>
+    </w:p>
+    <w:p>
+      <w:pPr>
+        <w:pStyle w:val="BodyText"/>
+      </w:pPr>
+      <w:r>
+        <w:t>We can also adapt the conditional statement to find rows based on different criteria. For example, if we wanted to extract all rows with alligators that were greater than the average length, we could do:</w:t>
+      </w:r>
+    </w:p>
+    <w:p>
+      <w:pPr>
+        <w:pStyle w:val="SourceCode"/>
+      </w:pPr>
+      <w:r>
+        <w:rPr>
+          <w:rStyle w:val="CommentTok"/>
+        </w:rPr>
+        <w:t># Calculate the average alligator length</w:t>
+      </w:r>
+      <w:r>
+        <w:br/>
+      </w:r>
+      <w:r>
+        <w:rPr>
+          <w:rStyle w:val="NormalTok"/>
+        </w:rPr>
+        <w:t xml:space="preserve">average_length </w:t>
+      </w:r>
+      <w:r>
+        <w:rPr>
+          <w:rStyle w:val="OtherTok"/>
+        </w:rPr>
+        <w:t>&lt;-</w:t>
+      </w:r>
+      <w:r>
+        <w:rPr>
+          <w:rStyle w:val="NormalTok"/>
+        </w:rPr>
+        <w:t xml:space="preserve"> </w:t>
+      </w:r>
+      <w:r>
+        <w:rPr>
+          <w:rStyle w:val="FunctionTok"/>
+        </w:rPr>
+        <w:t>mean</w:t>
+      </w:r>
+      <w:r>
+        <w:rPr>
+          <w:rStyle w:val="NormalTok"/>
+        </w:rPr>
+        <w:t>(ali</w:t>
+      </w:r>
+      <w:r>
+        <w:rPr>
+          <w:rStyle w:val="SpecialCharTok"/>
+        </w:rPr>
+        <w:t>$</w:t>
+      </w:r>
+      <w:r>
+        <w:rPr>
+          <w:rStyle w:val="NormalTok"/>
+        </w:rPr>
+        <w:t>length)</w:t>
+      </w:r>
+      <w:r>
+        <w:br/>
+      </w:r>
+      <w:r>
+        <w:br/>
+      </w:r>
+      <w:r>
+        <w:rPr>
+          <w:rStyle w:val="CommentTok"/>
+        </w:rPr>
+        <w:t># Extract all rows where the alligator length is greater than the average</w:t>
+      </w:r>
+      <w:r>
+        <w:br/>
+      </w:r>
+      <w:r>
+        <w:rPr>
+          <w:rStyle w:val="NormalTok"/>
+        </w:rPr>
+        <w:t>ali[ali</w:t>
+      </w:r>
+      <w:r>
+        <w:rPr>
+          <w:rStyle w:val="SpecialCharTok"/>
+        </w:rPr>
+        <w:t>$</w:t>
+      </w:r>
+      <w:r>
+        <w:rPr>
+          <w:rStyle w:val="NormalTok"/>
+        </w:rPr>
+        <w:t xml:space="preserve">length </w:t>
+      </w:r>
+      <w:r>
+        <w:rPr>
+          <w:rStyle w:val="SpecialCharTok"/>
+        </w:rPr>
+        <w:t>&gt;</w:t>
+      </w:r>
+      <w:r>
+        <w:rPr>
+          <w:rStyle w:val="NormalTok"/>
+        </w:rPr>
+        <w:t xml:space="preserve"> average_length, ]</w:t>
+      </w:r>
+    </w:p>
+    <w:p>
+      <w:pPr>
+        <w:pStyle w:val="FirstParagraph"/>
+      </w:pPr>
+      <w:r>
+        <w:t xml:space="preserve">In this case, </w:t>
+      </w:r>
+      <w:r>
+        <w:rPr>
+          <w:rStyle w:val="VerbatimChar"/>
+        </w:rPr>
+        <w:t>ali[ali$length &gt; average_length, ]</w:t>
+      </w:r>
+      <w:r>
+        <w:t xml:space="preserve"> will give us all columns for rows where the length of the alligator is greater than the calculated average length.</w:t>
+      </w:r>
+    </w:p>
+    <w:p>
+      <w:pPr>
+        <w:pStyle w:val="BodyText"/>
+      </w:pPr>
+      <w:r>
+        <w:t>We now get data from more than one alligator, as more than one alligator meets our condition of being longer than average. We can also see the “data entry mistake alligator” using this method.</w:t>
+      </w:r>
+    </w:p>
+    <w:p>
+      <w:pPr>
+        <w:pStyle w:val="BodyText"/>
+      </w:pPr>
+      <w:r>
+        <w:t xml:space="preserve">Let’s refine our approach further by using a different function: </w:t>
+      </w:r>
+      <w:r>
+        <w:rPr>
+          <w:rStyle w:val="VerbatimChar"/>
+        </w:rPr>
+        <w:t>quantile()</w:t>
+      </w:r>
+      <w:r>
+        <w:t xml:space="preserve">. First, rerun the </w:t>
+      </w:r>
+      <w:r>
+        <w:rPr>
+          <w:rStyle w:val="VerbatimChar"/>
+        </w:rPr>
+        <w:t>summary(ali)</w:t>
+      </w:r>
+      <w:r>
+        <w:t xml:space="preserve"> code to observe the quantiles (</w:t>
+      </w:r>
+      <w:r>
+        <w:rPr>
+          <w:rStyle w:val="VerbatimChar"/>
+        </w:rPr>
+        <w:t>1st Qu.</w:t>
+      </w:r>
+      <w:r>
+        <w:t xml:space="preserve"> and </w:t>
+      </w:r>
+      <w:r>
+        <w:rPr>
+          <w:rStyle w:val="VerbatimChar"/>
+        </w:rPr>
+        <w:t>3rd Qu.</w:t>
+      </w:r>
+      <w:r>
+        <w:t xml:space="preserve">) that it reports. These </w:t>
+      </w:r>
+      <w:r>
         <w:lastRenderedPageBreak/>
-        <w:t>Well, they’re clearly different. The first alligator in our dataset looks pretty normal. Maybe a bit on the big side, but not weirdly so. There are only two possible explanations for this. Either there are giant alligators among us. Or, there has been a data entry mistake.</w:t>
+        <w:t>quantiles represent the values below which 25% of the data falls and above which 75% of the data falls.</w:t>
+      </w:r>
+    </w:p>
+    <w:p>
+      <w:pPr>
+        <w:pStyle w:val="BodyText"/>
+      </w:pPr>
+      <w:r>
+        <w:t>We can retrieve these quantile values ourselves by doing:</w:t>
+      </w:r>
+    </w:p>
+    <w:p>
+      <w:pPr>
+        <w:pStyle w:val="SourceCode"/>
+      </w:pPr>
+      <w:r>
+        <w:rPr>
+          <w:rStyle w:val="FunctionTok"/>
+        </w:rPr>
+        <w:t>quantile</w:t>
+      </w:r>
+      <w:r>
+        <w:rPr>
+          <w:rStyle w:val="NormalTok"/>
+        </w:rPr>
+        <w:t>(ali</w:t>
+      </w:r>
+      <w:r>
+        <w:rPr>
+          <w:rStyle w:val="SpecialCharTok"/>
+        </w:rPr>
+        <w:t>$</w:t>
+      </w:r>
+      <w:r>
+        <w:rPr>
+          <w:rStyle w:val="NormalTok"/>
+        </w:rPr>
+        <w:t xml:space="preserve">length, </w:t>
+      </w:r>
+      <w:r>
+        <w:rPr>
+          <w:rStyle w:val="AttributeTok"/>
+        </w:rPr>
+        <w:t>probs =</w:t>
+      </w:r>
+      <w:r>
+        <w:rPr>
+          <w:rStyle w:val="NormalTok"/>
+        </w:rPr>
+        <w:t xml:space="preserve"> </w:t>
+      </w:r>
+      <w:r>
+        <w:rPr>
+          <w:rStyle w:val="FunctionTok"/>
+        </w:rPr>
+        <w:t>c</w:t>
+      </w:r>
+      <w:r>
+        <w:rPr>
+          <w:rStyle w:val="NormalTok"/>
+        </w:rPr>
+        <w:t>(</w:t>
+      </w:r>
+      <w:r>
+        <w:rPr>
+          <w:rStyle w:val="FloatTok"/>
+        </w:rPr>
+        <w:t>0.25</w:t>
+      </w:r>
+      <w:r>
+        <w:rPr>
+          <w:rStyle w:val="NormalTok"/>
+        </w:rPr>
+        <w:t>,</w:t>
+      </w:r>
+      <w:r>
+        <w:rPr>
+          <w:rStyle w:val="FloatTok"/>
+        </w:rPr>
+        <w:t>0.75</w:t>
+      </w:r>
+      <w:r>
+        <w:rPr>
+          <w:rStyle w:val="NormalTok"/>
+        </w:rPr>
+        <w:t>))</w:t>
+      </w:r>
+    </w:p>
+    <w:p>
+      <w:pPr>
+        <w:pStyle w:val="FirstParagraph"/>
+      </w:pPr>
+      <w:r>
+        <w:t xml:space="preserve">The </w:t>
+      </w:r>
+      <w:r>
+        <w:rPr>
+          <w:rStyle w:val="VerbatimChar"/>
+        </w:rPr>
+        <w:t>probs</w:t>
+      </w:r>
+      <w:r>
+        <w:t xml:space="preserve"> argument in the </w:t>
+      </w:r>
+      <w:r>
+        <w:rPr>
+          <w:rStyle w:val="VerbatimChar"/>
+        </w:rPr>
+        <w:t>quantile()</w:t>
+      </w:r>
+      <w:r>
+        <w:t xml:space="preserve"> function allows us to specify which probabilities we want to calculate quantiles for. In the previous example, we requested the 25% (</w:t>
+      </w:r>
+      <w:r>
+        <w:rPr>
+          <w:rStyle w:val="VerbatimChar"/>
+        </w:rPr>
+        <w:t>0.25</w:t>
+      </w:r>
+      <w:r>
+        <w:t>) and 75% (</w:t>
+      </w:r>
+      <w:r>
+        <w:rPr>
+          <w:rStyle w:val="VerbatimChar"/>
+        </w:rPr>
+        <w:t>0.75</w:t>
+      </w:r>
+      <w:r>
+        <w:t xml:space="preserve">) quantiles. Since we wanted to get these two values, we used the </w:t>
+      </w:r>
+      <w:r>
+        <w:rPr>
+          <w:rStyle w:val="VerbatimChar"/>
+        </w:rPr>
+        <w:t>c()</w:t>
+      </w:r>
+      <w:r>
+        <w:t xml:space="preserve"> function, which combines (or “concatenates”) multiple values into a single vector.</w:t>
+      </w:r>
+    </w:p>
+    <w:p>
+      <w:pPr>
+        <w:pStyle w:val="BodyText"/>
+      </w:pPr>
+      <w:r>
+        <w:t xml:space="preserve">If we only need a single quantile, such as the 75th percentile, we can directly write </w:t>
+      </w:r>
+      <w:r>
+        <w:rPr>
+          <w:rStyle w:val="VerbatimChar"/>
+        </w:rPr>
+        <w:t>quantile(ali$length, probs = 0.75)</w:t>
+      </w:r>
+      <w:r>
+        <w:t xml:space="preserve">. In this case, there’s no need to use </w:t>
+      </w:r>
+      <w:r>
+        <w:rPr>
+          <w:rStyle w:val="VerbatimChar"/>
+        </w:rPr>
+        <w:t>c()</w:t>
+      </w:r>
+      <w:r>
+        <w:t xml:space="preserve"> because we’re only asking for one value.</w:t>
       </w:r>
     </w:p>
     <w:p>
       <w:pPr>
         <w:pStyle w:val="Heading2"/>
       </w:pPr>
-      <w:bookmarkStart w:id="36" w:name="question-set-three"/>
-      <w:bookmarkStart w:id="37" w:name="_Toc174535080"/>
-      <w:r>
-        <w:t>Question Set Three</w:t>
+      <w:bookmarkStart w:id="36" w:name="question-set-four"/>
+      <w:bookmarkStart w:id="37" w:name="_Toc176426929"/>
+      <w:r>
+        <w:t>Question Set Four</w:t>
       </w:r>
       <w:bookmarkEnd w:id="37"/>
     </w:p>
@@ -6775,638 +6417,93 @@
         <w:pStyle w:val="FirstParagraph"/>
       </w:pPr>
       <w:r>
-        <w:t>Question 1. What may have occurred to have caused this apparent data entry mistake?</w:t>
+        <w:t xml:space="preserve">Question 1. Using </w:t>
+      </w:r>
+      <w:r>
+        <w:rPr>
+          <w:rStyle w:val="VerbatimChar"/>
+        </w:rPr>
+        <w:t>quantile()</w:t>
+      </w:r>
+      <w:r>
+        <w:t xml:space="preserve"> extract all rows in the </w:t>
+      </w:r>
+      <w:r>
+        <w:rPr>
+          <w:rStyle w:val="VerbatimChar"/>
+        </w:rPr>
+        <w:t>ali</w:t>
+      </w:r>
+      <w:r>
+        <w:t xml:space="preserve"> dataset where </w:t>
+      </w:r>
+      <w:r>
+        <w:rPr>
+          <w:rStyle w:val="VerbatimChar"/>
+        </w:rPr>
+        <w:t>bite</w:t>
+      </w:r>
+      <w:r>
+        <w:t xml:space="preserve"> values are above the 3rd quantile.</w:t>
+      </w:r>
+    </w:p>
+    <w:p>
+      <w:pPr>
+        <w:pStyle w:val="BodyText"/>
+      </w:pPr>
+      <w:r>
+        <w:t xml:space="preserve">Question 2. Repeat the above, but for </w:t>
+      </w:r>
+      <w:r>
+        <w:rPr>
+          <w:rStyle w:val="VerbatimChar"/>
+        </w:rPr>
+        <w:t>bite</w:t>
+      </w:r>
+      <w:r>
+        <w:t xml:space="preserve"> values </w:t>
+      </w:r>
+      <w:r>
+        <w:rPr>
+          <w:i/>
+          <w:iCs/>
+        </w:rPr>
+        <w:t>less than or equal to</w:t>
+      </w:r>
+      <w:r>
+        <w:t xml:space="preserve"> the 33% quantile. If you’re unsure how to specify </w:t>
+      </w:r>
+      <w:r>
+        <w:rPr>
+          <w:i/>
+          <w:iCs/>
+        </w:rPr>
+        <w:t>less than or equal to</w:t>
+      </w:r>
+      <w:r>
+        <w:t xml:space="preserve"> have a quick search online or use your preferred LLM.</w:t>
+      </w:r>
+    </w:p>
+    <w:p>
+      <w:pPr>
+        <w:pStyle w:val="BodyText"/>
+      </w:pPr>
+      <w:r>
+        <w:t>Question 3. Using the tools from above, can you identify any other possible data entry mistakes caused by missing decimal points?</w:t>
       </w:r>
     </w:p>
     <w:p>
       <w:pPr>
         <w:pStyle w:val="Heading1"/>
       </w:pPr>
-      <w:bookmarkStart w:id="38" w:name="a-more-refined-detective"/>
-      <w:bookmarkStart w:id="39" w:name="_Toc174535081"/>
+      <w:bookmarkStart w:id="38" w:name="correcting-data"/>
+      <w:bookmarkStart w:id="39" w:name="_Toc176426930"/>
       <w:bookmarkEnd w:id="34"/>
       <w:bookmarkEnd w:id="36"/>
       <w:r>
-        <w:t>A More Refined Detective</w:t>
+        <w:t>Correcting Data</w:t>
       </w:r>
       <w:bookmarkEnd w:id="39"/>
-    </w:p>
-    <w:p>
-      <w:pPr>
-        <w:pStyle w:val="FirstParagraph"/>
-      </w:pPr>
-      <w:r>
-        <w:t>The method we used to identify the data entry mistake is effective, but what if we want to be a more refined programmer and avoid repeatedly writing out 2293?</w:t>
-      </w:r>
-    </w:p>
-    <w:p>
-      <w:pPr>
-        <w:pStyle w:val="BodyText"/>
-      </w:pPr>
-      <w:r>
-        <w:t xml:space="preserve">Instead, we can use a function that returns the maximum alligator length. The function to do just that is called </w:t>
-      </w:r>
-      <w:r>
-        <w:rPr>
-          <w:rStyle w:val="VerbatimChar"/>
-        </w:rPr>
-        <w:t>max()</w:t>
-      </w:r>
-      <w:r>
-        <w:t>:</w:t>
-      </w:r>
-    </w:p>
-    <w:p>
-      <w:pPr>
-        <w:pStyle w:val="SourceCode"/>
-      </w:pPr>
-      <w:r>
-        <w:rPr>
-          <w:rStyle w:val="CommentTok"/>
-        </w:rPr>
-        <w:t># Get the maximum alligator length</w:t>
-      </w:r>
-      <w:r>
-        <w:br/>
-      </w:r>
-      <w:r>
-        <w:rPr>
-          <w:rStyle w:val="NormalTok"/>
-        </w:rPr>
-        <w:t xml:space="preserve">max_length </w:t>
-      </w:r>
-      <w:r>
-        <w:rPr>
-          <w:rStyle w:val="OtherTok"/>
-        </w:rPr>
-        <w:t>&lt;-</w:t>
-      </w:r>
-      <w:r>
-        <w:rPr>
-          <w:rStyle w:val="NormalTok"/>
-        </w:rPr>
-        <w:t xml:space="preserve"> </w:t>
-      </w:r>
-      <w:r>
-        <w:rPr>
-          <w:rStyle w:val="FunctionTok"/>
-        </w:rPr>
-        <w:t>max</w:t>
-      </w:r>
-      <w:r>
-        <w:rPr>
-          <w:rStyle w:val="NormalTok"/>
-        </w:rPr>
-        <w:t>(ali</w:t>
-      </w:r>
-      <w:r>
-        <w:rPr>
-          <w:rStyle w:val="SpecialCharTok"/>
-        </w:rPr>
-        <w:t>$</w:t>
-      </w:r>
-      <w:r>
-        <w:rPr>
-          <w:rStyle w:val="NormalTok"/>
-        </w:rPr>
-        <w:t>length)</w:t>
-      </w:r>
-      <w:r>
-        <w:br/>
-      </w:r>
-      <w:r>
-        <w:br/>
-      </w:r>
-      <w:r>
-        <w:rPr>
-          <w:rStyle w:val="CommentTok"/>
-        </w:rPr>
-        <w:t># Now use this value to find the problematic rows</w:t>
-      </w:r>
-      <w:r>
-        <w:br/>
-      </w:r>
-      <w:r>
-        <w:rPr>
-          <w:rStyle w:val="NormalTok"/>
-        </w:rPr>
-        <w:t>ali[ali</w:t>
-      </w:r>
-      <w:r>
-        <w:rPr>
-          <w:rStyle w:val="SpecialCharTok"/>
-        </w:rPr>
-        <w:t>$</w:t>
-      </w:r>
-      <w:r>
-        <w:rPr>
-          <w:rStyle w:val="NormalTok"/>
-        </w:rPr>
-        <w:t xml:space="preserve">length </w:t>
-      </w:r>
-      <w:r>
-        <w:rPr>
-          <w:rStyle w:val="SpecialCharTok"/>
-        </w:rPr>
-        <w:t>==</w:t>
-      </w:r>
-      <w:r>
-        <w:rPr>
-          <w:rStyle w:val="NormalTok"/>
-        </w:rPr>
-        <w:t xml:space="preserve"> max_length, ]</w:t>
-      </w:r>
-    </w:p>
-    <w:p>
-      <w:pPr>
-        <w:pStyle w:val="FirstParagraph"/>
-      </w:pPr>
-      <w:r>
-        <w:t xml:space="preserve">By storing the result of </w:t>
-      </w:r>
-      <w:r>
-        <w:rPr>
-          <w:rStyle w:val="VerbatimChar"/>
-        </w:rPr>
-        <w:t>max(ali$length)</w:t>
-      </w:r>
-      <w:r>
-        <w:t xml:space="preserve"> in a variable (</w:t>
-      </w:r>
-      <w:r>
-        <w:rPr>
-          <w:rStyle w:val="VerbatimChar"/>
-        </w:rPr>
-        <w:t>max_length</w:t>
-      </w:r>
-      <w:r>
-        <w:t xml:space="preserve">), we can simplify our code and make it more readable. This way, if we need to refer to the maximum length multiple times, we only need to use the </w:t>
-      </w:r>
-      <w:r>
-        <w:rPr>
-          <w:rStyle w:val="VerbatimChar"/>
-        </w:rPr>
-        <w:t>max_length</w:t>
-      </w:r>
-      <w:r>
-        <w:t xml:space="preserve"> variable. Within the </w:t>
-      </w:r>
-      <w:r>
-        <w:rPr>
-          <w:rStyle w:val="VerbatimChar"/>
-        </w:rPr>
-        <w:t>ali</w:t>
-      </w:r>
-      <w:r>
-        <w:t xml:space="preserve"> dataset, this code extracts all columns (since we have not specified anything after the comma in the square brackets) for any rows where the length of an alligator is equal to the maximum length of any alligator.</w:t>
-      </w:r>
-    </w:p>
-    <w:p>
-      <w:pPr>
-        <w:pStyle w:val="BodyText"/>
-      </w:pPr>
-      <w:r>
-        <w:t>We can also adapt the conditional statement to find rows based on different criteria. For example, if we wanted to extract all rows with alligators that were greater than the average length, we could do:</w:t>
-      </w:r>
-    </w:p>
-    <w:p>
-      <w:pPr>
-        <w:pStyle w:val="SourceCode"/>
-      </w:pPr>
-      <w:r>
-        <w:rPr>
-          <w:rStyle w:val="CommentTok"/>
-        </w:rPr>
-        <w:t># Calculate the average alligator length</w:t>
-      </w:r>
-      <w:r>
-        <w:br/>
-      </w:r>
-      <w:r>
-        <w:rPr>
-          <w:rStyle w:val="NormalTok"/>
-        </w:rPr>
-        <w:t xml:space="preserve">average_length </w:t>
-      </w:r>
-      <w:r>
-        <w:rPr>
-          <w:rStyle w:val="OtherTok"/>
-        </w:rPr>
-        <w:t>&lt;-</w:t>
-      </w:r>
-      <w:r>
-        <w:rPr>
-          <w:rStyle w:val="NormalTok"/>
-        </w:rPr>
-        <w:t xml:space="preserve"> </w:t>
-      </w:r>
-      <w:r>
-        <w:rPr>
-          <w:rStyle w:val="FunctionTok"/>
-        </w:rPr>
-        <w:t>mean</w:t>
-      </w:r>
-      <w:r>
-        <w:rPr>
-          <w:rStyle w:val="NormalTok"/>
-        </w:rPr>
-        <w:t>(ali</w:t>
-      </w:r>
-      <w:r>
-        <w:rPr>
-          <w:rStyle w:val="SpecialCharTok"/>
-        </w:rPr>
-        <w:t>$</w:t>
-      </w:r>
-      <w:r>
-        <w:rPr>
-          <w:rStyle w:val="NormalTok"/>
-        </w:rPr>
-        <w:t>length)</w:t>
-      </w:r>
-      <w:r>
-        <w:br/>
-      </w:r>
-      <w:r>
-        <w:br/>
-      </w:r>
-      <w:r>
-        <w:rPr>
-          <w:rStyle w:val="CommentTok"/>
-        </w:rPr>
-        <w:t># Extract all rows where the alligator length is greater than the average</w:t>
-      </w:r>
-      <w:r>
-        <w:br/>
-      </w:r>
-      <w:r>
-        <w:rPr>
-          <w:rStyle w:val="NormalTok"/>
-        </w:rPr>
-        <w:t>ali[ali</w:t>
-      </w:r>
-      <w:r>
-        <w:rPr>
-          <w:rStyle w:val="SpecialCharTok"/>
-        </w:rPr>
-        <w:t>$</w:t>
-      </w:r>
-      <w:r>
-        <w:rPr>
-          <w:rStyle w:val="NormalTok"/>
-        </w:rPr>
-        <w:t xml:space="preserve">length </w:t>
-      </w:r>
-      <w:r>
-        <w:rPr>
-          <w:rStyle w:val="SpecialCharTok"/>
-        </w:rPr>
-        <w:t>&gt;</w:t>
-      </w:r>
-      <w:r>
-        <w:rPr>
-          <w:rStyle w:val="NormalTok"/>
-        </w:rPr>
-        <w:t xml:space="preserve"> average_length, ]</w:t>
-      </w:r>
-    </w:p>
-    <w:p>
-      <w:pPr>
-        <w:pStyle w:val="FirstParagraph"/>
-      </w:pPr>
-      <w:r>
-        <w:t xml:space="preserve">In this case, </w:t>
-      </w:r>
-      <w:r>
-        <w:rPr>
-          <w:rStyle w:val="VerbatimChar"/>
-        </w:rPr>
-        <w:t>ali[ali$length &gt; average_length, ]</w:t>
-      </w:r>
-      <w:r>
-        <w:t xml:space="preserve"> will give us all columns for rows where the length of the alligator is greater than the calculated average length.</w:t>
-      </w:r>
-    </w:p>
-    <w:p>
-      <w:pPr>
-        <w:pStyle w:val="BodyText"/>
-      </w:pPr>
-      <w:r>
-        <w:t>We now get data from more than one alligator, as more than one alligator meets our condition of being longer than average. We can also see the “data entry mistake alligator” using this method.</w:t>
-      </w:r>
-    </w:p>
-    <w:p>
-      <w:pPr>
-        <w:pStyle w:val="BodyText"/>
-      </w:pPr>
-      <w:r>
-        <w:t xml:space="preserve">Let’s refine our approach further by using a different function: </w:t>
-      </w:r>
-      <w:r>
-        <w:rPr>
-          <w:rStyle w:val="VerbatimChar"/>
-        </w:rPr>
-        <w:t>quantile()</w:t>
-      </w:r>
-      <w:r>
-        <w:t xml:space="preserve">. First, rerun the </w:t>
-      </w:r>
-      <w:r>
-        <w:rPr>
-          <w:rStyle w:val="VerbatimChar"/>
-        </w:rPr>
-        <w:t>summary(ali)</w:t>
-      </w:r>
-      <w:r>
-        <w:t xml:space="preserve"> code to observe the quantiles (</w:t>
-      </w:r>
-      <w:r>
-        <w:rPr>
-          <w:rStyle w:val="VerbatimChar"/>
-        </w:rPr>
-        <w:t>1st Qu.</w:t>
-      </w:r>
-      <w:r>
-        <w:t xml:space="preserve"> and </w:t>
-      </w:r>
-      <w:r>
-        <w:rPr>
-          <w:rStyle w:val="VerbatimChar"/>
-        </w:rPr>
-        <w:t>3rd Qu.</w:t>
-      </w:r>
-      <w:r>
-        <w:t>) that it reports. These quantiles represent the values below which 25% of the data falls and above which 75% of the data falls.</w:t>
-      </w:r>
-    </w:p>
-    <w:p>
-      <w:pPr>
-        <w:pStyle w:val="BodyText"/>
-      </w:pPr>
-      <w:r>
-        <w:t>We can retrieve these quantile values ourselves by doing:</w:t>
-      </w:r>
-    </w:p>
-    <w:p>
-      <w:pPr>
-        <w:pStyle w:val="SourceCode"/>
-      </w:pPr>
-      <w:r>
-        <w:rPr>
-          <w:rStyle w:val="FunctionTok"/>
-        </w:rPr>
-        <w:lastRenderedPageBreak/>
-        <w:t>quantile</w:t>
-      </w:r>
-      <w:r>
-        <w:rPr>
-          <w:rStyle w:val="NormalTok"/>
-        </w:rPr>
-        <w:t>(ali</w:t>
-      </w:r>
-      <w:r>
-        <w:rPr>
-          <w:rStyle w:val="SpecialCharTok"/>
-        </w:rPr>
-        <w:t>$</w:t>
-      </w:r>
-      <w:r>
-        <w:rPr>
-          <w:rStyle w:val="NormalTok"/>
-        </w:rPr>
-        <w:t xml:space="preserve">length, </w:t>
-      </w:r>
-      <w:r>
-        <w:rPr>
-          <w:rStyle w:val="AttributeTok"/>
-        </w:rPr>
-        <w:t>probs =</w:t>
-      </w:r>
-      <w:r>
-        <w:rPr>
-          <w:rStyle w:val="NormalTok"/>
-        </w:rPr>
-        <w:t xml:space="preserve"> </w:t>
-      </w:r>
-      <w:r>
-        <w:rPr>
-          <w:rStyle w:val="FunctionTok"/>
-        </w:rPr>
-        <w:t>c</w:t>
-      </w:r>
-      <w:r>
-        <w:rPr>
-          <w:rStyle w:val="NormalTok"/>
-        </w:rPr>
-        <w:t>(</w:t>
-      </w:r>
-      <w:r>
-        <w:rPr>
-          <w:rStyle w:val="FloatTok"/>
-        </w:rPr>
-        <w:t>0.25</w:t>
-      </w:r>
-      <w:r>
-        <w:rPr>
-          <w:rStyle w:val="NormalTok"/>
-        </w:rPr>
-        <w:t>,</w:t>
-      </w:r>
-      <w:r>
-        <w:rPr>
-          <w:rStyle w:val="FloatTok"/>
-        </w:rPr>
-        <w:t>0.75</w:t>
-      </w:r>
-      <w:r>
-        <w:rPr>
-          <w:rStyle w:val="NormalTok"/>
-        </w:rPr>
-        <w:t>))</w:t>
-      </w:r>
-    </w:p>
-    <w:p>
-      <w:pPr>
-        <w:pStyle w:val="FirstParagraph"/>
-      </w:pPr>
-      <w:r>
-        <w:t xml:space="preserve">The </w:t>
-      </w:r>
-      <w:r>
-        <w:rPr>
-          <w:rStyle w:val="VerbatimChar"/>
-        </w:rPr>
-        <w:t>probs</w:t>
-      </w:r>
-      <w:r>
-        <w:t xml:space="preserve"> argument in the </w:t>
-      </w:r>
-      <w:r>
-        <w:rPr>
-          <w:rStyle w:val="VerbatimChar"/>
-        </w:rPr>
-        <w:t>quantile()</w:t>
-      </w:r>
-      <w:r>
-        <w:t xml:space="preserve"> function allows us to specify which probabilities we want to calculate quantiles for. In the previous example, we requested the 25% (</w:t>
-      </w:r>
-      <w:r>
-        <w:rPr>
-          <w:rStyle w:val="VerbatimChar"/>
-        </w:rPr>
-        <w:t>0.25</w:t>
-      </w:r>
-      <w:r>
-        <w:t>) and 75% (</w:t>
-      </w:r>
-      <w:r>
-        <w:rPr>
-          <w:rStyle w:val="VerbatimChar"/>
-        </w:rPr>
-        <w:t>0.75</w:t>
-      </w:r>
-      <w:r>
-        <w:t xml:space="preserve">) quantiles. Since we wanted to get these two values, we used the </w:t>
-      </w:r>
-      <w:r>
-        <w:rPr>
-          <w:rStyle w:val="VerbatimChar"/>
-        </w:rPr>
-        <w:t>c()</w:t>
-      </w:r>
-      <w:r>
-        <w:t xml:space="preserve"> function, which combines (or “concatenates”) multiple values into a single vector.</w:t>
-      </w:r>
-    </w:p>
-    <w:p>
-      <w:pPr>
-        <w:pStyle w:val="BodyText"/>
-      </w:pPr>
-      <w:r>
-        <w:t xml:space="preserve">If we only need a single quantile, such as the 75th percentile, we can directly write </w:t>
-      </w:r>
-      <w:r>
-        <w:rPr>
-          <w:rStyle w:val="VerbatimChar"/>
-        </w:rPr>
-        <w:t>quantile(ali$length, probs = 0.75)</w:t>
-      </w:r>
-      <w:r>
-        <w:t xml:space="preserve">. In this case, there’s no need to use </w:t>
-      </w:r>
-      <w:r>
-        <w:rPr>
-          <w:rStyle w:val="VerbatimChar"/>
-        </w:rPr>
-        <w:t>c()</w:t>
-      </w:r>
-      <w:r>
-        <w:t xml:space="preserve"> because we’re only asking for one value.</w:t>
-      </w:r>
-    </w:p>
-    <w:p>
-      <w:pPr>
-        <w:pStyle w:val="Heading2"/>
-      </w:pPr>
-      <w:bookmarkStart w:id="40" w:name="question-set-four"/>
-      <w:bookmarkStart w:id="41" w:name="_Toc174535082"/>
-      <w:r>
-        <w:t>Question Set Four</w:t>
-      </w:r>
-      <w:bookmarkEnd w:id="41"/>
-    </w:p>
-    <w:p>
-      <w:pPr>
-        <w:pStyle w:val="FirstParagraph"/>
-      </w:pPr>
-      <w:r>
-        <w:t xml:space="preserve">Question 1. Using </w:t>
-      </w:r>
-      <w:r>
-        <w:rPr>
-          <w:rStyle w:val="VerbatimChar"/>
-        </w:rPr>
-        <w:t>quantile()</w:t>
-      </w:r>
-      <w:r>
-        <w:t xml:space="preserve"> extract all rows in the </w:t>
-      </w:r>
-      <w:r>
-        <w:rPr>
-          <w:rStyle w:val="VerbatimChar"/>
-        </w:rPr>
-        <w:t>ali</w:t>
-      </w:r>
-      <w:r>
-        <w:t xml:space="preserve"> dataset where </w:t>
-      </w:r>
-      <w:r>
-        <w:rPr>
-          <w:rStyle w:val="VerbatimChar"/>
-        </w:rPr>
-        <w:t>bite</w:t>
-      </w:r>
-      <w:r>
-        <w:t xml:space="preserve"> values are above the 3rd quantile.</w:t>
-      </w:r>
-    </w:p>
-    <w:p>
-      <w:pPr>
-        <w:pStyle w:val="BodyText"/>
-      </w:pPr>
-      <w:r>
-        <w:t xml:space="preserve">Question 2. Repeat the above, but for </w:t>
-      </w:r>
-      <w:r>
-        <w:rPr>
-          <w:rStyle w:val="VerbatimChar"/>
-        </w:rPr>
-        <w:t>bite</w:t>
-      </w:r>
-      <w:r>
-        <w:t xml:space="preserve"> values </w:t>
-      </w:r>
-      <w:r>
-        <w:rPr>
-          <w:i/>
-          <w:iCs/>
-        </w:rPr>
-        <w:t>less than or equal to</w:t>
-      </w:r>
-      <w:r>
-        <w:t xml:space="preserve"> the 33% quantile. If you’re unsure how to specify </w:t>
-      </w:r>
-      <w:r>
-        <w:rPr>
-          <w:i/>
-          <w:iCs/>
-        </w:rPr>
-        <w:t>less than or equal to</w:t>
-      </w:r>
-      <w:r>
-        <w:t xml:space="preserve"> have a quick search online or use your preferred LLM.</w:t>
-      </w:r>
-    </w:p>
-    <w:p>
-      <w:pPr>
-        <w:pStyle w:val="BodyText"/>
-      </w:pPr>
-      <w:r>
-        <w:t>Question 3. Using the tools from above, can you identify any other possible data entry mistakes caused by missing decimal points?</w:t>
-      </w:r>
-    </w:p>
-    <w:p>
-      <w:pPr>
-        <w:pStyle w:val="Heading1"/>
-      </w:pPr>
-      <w:bookmarkStart w:id="42" w:name="correcting-data"/>
-      <w:bookmarkStart w:id="43" w:name="_Toc174535083"/>
-      <w:bookmarkEnd w:id="38"/>
-      <w:bookmarkEnd w:id="40"/>
-      <w:r>
-        <w:t>Correcting Data</w:t>
-      </w:r>
-      <w:bookmarkEnd w:id="43"/>
     </w:p>
     <w:p>
       <w:pPr>
@@ -7559,6 +6656,7 @@
         <w:pStyle w:val="BodyText"/>
       </w:pPr>
       <w:r>
+        <w:lastRenderedPageBreak/>
         <w:t xml:space="preserve">We have two options: fix the data in </w:t>
       </w:r>
       <w:r>
@@ -7596,11 +6694,7 @@
         <w:t>R</w:t>
       </w:r>
       <w:r>
-        <w:t xml:space="preserve">. Doing so makes our change clear and transparent - the change is right there in the code for all to see. Doing it </w:t>
-      </w:r>
-      <w:r>
-        <w:lastRenderedPageBreak/>
-        <w:t xml:space="preserve">in Excel means that we’re kind of obscuring it, or at least we’d have to say “We had this weird observation, but we’ve totally sorted it out. Don’t worry. </w:t>
+        <w:t xml:space="preserve">. Doing so makes our change clear and transparent - the change is right there in the code for all to see. Doing it in Excel means that we’re kind of obscuring it, or at least we’d have to say “We had this weird observation, but we’ve totally sorted it out. Don’t worry. </w:t>
       </w:r>
       <w:r>
         <w:rPr>
@@ -7880,12 +6974,12 @@
       <w:pPr>
         <w:pStyle w:val="Heading2"/>
       </w:pPr>
-      <w:bookmarkStart w:id="44" w:name="question-set-five"/>
-      <w:bookmarkStart w:id="45" w:name="_Toc174535084"/>
+      <w:bookmarkStart w:id="40" w:name="question-set-five"/>
+      <w:bookmarkStart w:id="41" w:name="_Toc176426931"/>
       <w:r>
         <w:t>Question Set Five</w:t>
       </w:r>
-      <w:bookmarkEnd w:id="45"/>
+      <w:bookmarkEnd w:id="41"/>
     </w:p>
     <w:p>
       <w:pPr>
@@ -7922,14 +7016,14 @@
       <w:pPr>
         <w:pStyle w:val="Heading1"/>
       </w:pPr>
-      <w:bookmarkStart w:id="46" w:name="do-it-for-real"/>
-      <w:bookmarkStart w:id="47" w:name="_Toc174535085"/>
-      <w:bookmarkEnd w:id="42"/>
-      <w:bookmarkEnd w:id="44"/>
+      <w:bookmarkStart w:id="42" w:name="do-it-for-real"/>
+      <w:bookmarkStart w:id="43" w:name="_Toc176426932"/>
+      <w:bookmarkEnd w:id="38"/>
+      <w:bookmarkEnd w:id="40"/>
       <w:r>
         <w:t>Do it for real</w:t>
       </w:r>
-      <w:bookmarkEnd w:id="47"/>
+      <w:bookmarkEnd w:id="43"/>
     </w:p>
     <w:p>
       <w:pPr>
@@ -8041,6 +7135,7 @@
         </w:numPr>
       </w:pPr>
       <w:r>
+        <w:lastRenderedPageBreak/>
         <w:t>There are a total of five mistakes in the dataset.</w:t>
       </w:r>
     </w:p>
@@ -8067,20 +7162,19 @@
         <w:pStyle w:val="BodyText"/>
       </w:pPr>
       <w:r>
-        <w:lastRenderedPageBreak/>
-        <w:t>Can you find them all?</w:t>
+        <w:t>Can you find them all? Once you have, take a look at the instructions with answers to see what the values should be and attempt to resolve them.</w:t>
       </w:r>
     </w:p>
     <w:p>
       <w:pPr>
         <w:pStyle w:val="Heading2"/>
       </w:pPr>
-      <w:bookmarkStart w:id="48" w:name="information-about-the-dataset"/>
-      <w:bookmarkStart w:id="49" w:name="_Toc174535086"/>
+      <w:bookmarkStart w:id="44" w:name="information-about-the-dataset"/>
+      <w:bookmarkStart w:id="45" w:name="_Toc176426933"/>
       <w:r>
         <w:t>Information about the dataset:</w:t>
       </w:r>
-      <w:bookmarkEnd w:id="49"/>
+      <w:bookmarkEnd w:id="45"/>
     </w:p>
     <w:p>
       <w:pPr>
@@ -8147,8 +7241,61 @@
       <w:r>
         <w:t>Physical copies of the data are available should any data need to be verified (contact one of the teaching staff if you need a data entry confirmed).</w:t>
       </w:r>
+    </w:p>
+    <w:p>
+      <w:pPr>
+        <w:pStyle w:val="Heading2"/>
+      </w:pPr>
+      <w:bookmarkStart w:id="46" w:name="question-set-six"/>
+      <w:bookmarkStart w:id="47" w:name="_Toc176426934"/>
+      <w:bookmarkEnd w:id="44"/>
+      <w:r>
+        <w:t>Question Set Six</w:t>
+      </w:r>
+      <w:bookmarkEnd w:id="47"/>
+    </w:p>
+    <w:p>
+      <w:pPr>
+        <w:pStyle w:val="FirstParagraph"/>
+      </w:pPr>
+      <w:r>
+        <w:t>If you haven’t done so already, have a look at the instructions with the answers which contains what the actual values should be for four of the five data issues that you identified. Correct those values now (either using the code provided in the answer or create your own solution - there are multiple ways to correct the data here) then answer the following questions:</w:t>
+      </w:r>
+    </w:p>
+    <w:p>
+      <w:pPr>
+        <w:numPr>
+          <w:ilvl w:val="0"/>
+          <w:numId w:val="19"/>
+        </w:numPr>
+      </w:pPr>
+      <w:r>
+        <w:t>What is the median weight in this dataset?</w:t>
+      </w:r>
+    </w:p>
+    <w:p>
+      <w:pPr>
+        <w:numPr>
+          <w:ilvl w:val="0"/>
+          <w:numId w:val="19"/>
+        </w:numPr>
+      </w:pPr>
+      <w:r>
+        <w:t>What is the median speed in this dataset?</w:t>
+      </w:r>
+    </w:p>
+    <w:p>
+      <w:pPr>
+        <w:numPr>
+          <w:ilvl w:val="0"/>
+          <w:numId w:val="19"/>
+        </w:numPr>
+      </w:pPr>
+      <w:r>
+        <w:t>Which species is most common in this dataset?</w:t>
+      </w:r>
+      <w:bookmarkEnd w:id="42"/>
       <w:bookmarkEnd w:id="46"/>
-      <w:bookmarkEnd w:id="48"/>
     </w:p>
     <w:sectPr>
       <w:pgSz w:w="12240" w:h="15840"/>
@@ -8448,7 +7595,7 @@
   <w:abstractNum w:abstractNumId="3" w15:restartNumberingAfterBreak="0">
     <w:nsid w:val="00A99412"/>
     <w:multiLevelType w:val="multilevel"/>
-    <w:tmpl w:val="DE888454"/>
+    <w:tmpl w:val="7BEED5CA"/>
     <w:lvl w:ilvl="0">
       <w:start w:val="2"/>
       <w:numFmt w:val="decimal"/>
@@ -8534,7 +7681,7 @@
   <w:abstractNum w:abstractNumId="4" w15:restartNumberingAfterBreak="0">
     <w:nsid w:val="00A99413"/>
     <w:multiLevelType w:val="multilevel"/>
-    <w:tmpl w:val="F9CA8112"/>
+    <w:tmpl w:val="DB1A05A8"/>
     <w:lvl w:ilvl="0">
       <w:start w:val="3"/>
       <w:numFmt w:val="decimal"/>
@@ -8653,10 +7800,10 @@
       <w:startOverride w:val="1"/>
     </w:lvlOverride>
   </w:num>
-  <w:num w:numId="4" w16cid:durableId="1844859969">
+  <w:num w:numId="4" w16cid:durableId="728192401">
     <w:abstractNumId w:val="0"/>
   </w:num>
-  <w:num w:numId="5" w16cid:durableId="1387022050">
+  <w:num w:numId="5" w16cid:durableId="1780176771">
     <w:abstractNumId w:val="2"/>
     <w:lvlOverride w:ilvl="0">
       <w:startOverride w:val="1"/>
@@ -8686,7 +7833,7 @@
       <w:startOverride w:val="1"/>
     </w:lvlOverride>
   </w:num>
-  <w:num w:numId="6" w16cid:durableId="596133744">
+  <w:num w:numId="6" w16cid:durableId="1491827547">
     <w:abstractNumId w:val="2"/>
     <w:lvlOverride w:ilvl="0">
       <w:startOverride w:val="1"/>
@@ -8716,22 +7863,22 @@
       <w:startOverride w:val="1"/>
     </w:lvlOverride>
   </w:num>
-  <w:num w:numId="7" w16cid:durableId="755248912">
+  <w:num w:numId="7" w16cid:durableId="23330871">
     <w:abstractNumId w:val="1"/>
   </w:num>
-  <w:num w:numId="8" w16cid:durableId="1605527930">
+  <w:num w:numId="8" w16cid:durableId="1883012684">
     <w:abstractNumId w:val="1"/>
   </w:num>
-  <w:num w:numId="9" w16cid:durableId="2073691747">
+  <w:num w:numId="9" w16cid:durableId="1713070630">
     <w:abstractNumId w:val="1"/>
   </w:num>
-  <w:num w:numId="10" w16cid:durableId="866413178">
+  <w:num w:numId="10" w16cid:durableId="1591309990">
     <w:abstractNumId w:val="1"/>
   </w:num>
-  <w:num w:numId="11" w16cid:durableId="783354023">
+  <w:num w:numId="11" w16cid:durableId="116074166">
     <w:abstractNumId w:val="1"/>
   </w:num>
-  <w:num w:numId="12" w16cid:durableId="1199510364">
+  <w:num w:numId="12" w16cid:durableId="768618562">
     <w:abstractNumId w:val="2"/>
     <w:lvlOverride w:ilvl="0">
       <w:startOverride w:val="1"/>
@@ -8761,7 +7908,7 @@
       <w:startOverride w:val="1"/>
     </w:lvlOverride>
   </w:num>
-  <w:num w:numId="13" w16cid:durableId="1582988258">
+  <w:num w:numId="13" w16cid:durableId="1450468028">
     <w:abstractNumId w:val="2"/>
     <w:lvlOverride w:ilvl="0">
       <w:startOverride w:val="1"/>
@@ -8791,7 +7938,7 @@
       <w:startOverride w:val="1"/>
     </w:lvlOverride>
   </w:num>
-  <w:num w:numId="14" w16cid:durableId="254704407">
+  <w:num w:numId="14" w16cid:durableId="1749811891">
     <w:abstractNumId w:val="3"/>
     <w:lvlOverride w:ilvl="0">
       <w:startOverride w:val="2"/>
@@ -8821,7 +7968,7 @@
       <w:startOverride w:val="2"/>
     </w:lvlOverride>
   </w:num>
-  <w:num w:numId="15" w16cid:durableId="1078600352">
+  <w:num w:numId="15" w16cid:durableId="1979217622">
     <w:abstractNumId w:val="4"/>
     <w:lvlOverride w:ilvl="0">
       <w:startOverride w:val="3"/>
@@ -8851,7 +7998,7 @@
       <w:startOverride w:val="3"/>
     </w:lvlOverride>
   </w:num>
-  <w:num w:numId="16" w16cid:durableId="820315308">
+  <w:num w:numId="16" w16cid:durableId="1128667666">
     <w:abstractNumId w:val="2"/>
     <w:lvlOverride w:ilvl="0">
       <w:startOverride w:val="1"/>
@@ -8881,7 +8028,7 @@
       <w:startOverride w:val="1"/>
     </w:lvlOverride>
   </w:num>
-  <w:num w:numId="17" w16cid:durableId="1386176633">
+  <w:num w:numId="17" w16cid:durableId="1319461783">
     <w:abstractNumId w:val="2"/>
     <w:lvlOverride w:ilvl="0">
       <w:startOverride w:val="1"/>
@@ -8911,8 +8058,38 @@
       <w:startOverride w:val="1"/>
     </w:lvlOverride>
   </w:num>
-  <w:num w:numId="18" w16cid:durableId="1517230110">
+  <w:num w:numId="18" w16cid:durableId="690688004">
     <w:abstractNumId w:val="1"/>
+  </w:num>
+  <w:num w:numId="19" w16cid:durableId="1829401586">
+    <w:abstractNumId w:val="2"/>
+    <w:lvlOverride w:ilvl="0">
+      <w:startOverride w:val="1"/>
+    </w:lvlOverride>
+    <w:lvlOverride w:ilvl="1">
+      <w:startOverride w:val="1"/>
+    </w:lvlOverride>
+    <w:lvlOverride w:ilvl="2">
+      <w:startOverride w:val="1"/>
+    </w:lvlOverride>
+    <w:lvlOverride w:ilvl="3">
+      <w:startOverride w:val="1"/>
+    </w:lvlOverride>
+    <w:lvlOverride w:ilvl="4">
+      <w:startOverride w:val="1"/>
+    </w:lvlOverride>
+    <w:lvlOverride w:ilvl="5">
+      <w:startOverride w:val="1"/>
+    </w:lvlOverride>
+    <w:lvlOverride w:ilvl="6">
+      <w:startOverride w:val="1"/>
+    </w:lvlOverride>
+    <w:lvlOverride w:ilvl="7">
+      <w:startOverride w:val="1"/>
+    </w:lvlOverride>
+    <w:lvlOverride w:ilvl="8">
+      <w:startOverride w:val="1"/>
+    </w:lvlOverride>
   </w:num>
 </w:numbering>
 </file>

</xml_diff>